<commit_message>
Attendee material regenerated (13 Oct): deck after the formatting and fact pass (node failure as an animation of the documented behaviour, backup options as Microsoft Learn documents them, repo and follow-along URLs on the closing slide), handouts and follow-along guide as PDF, Word and Markdown, follow-along site source
</commit_message>
<xml_diff>
--- a/handouts/ASR_Failover_Procedures.docx
+++ b/handouts/ASR_Failover_Procedures.docx
@@ -1045,7 +1045,18 @@
           <w:szCs w:val="21"/>
           <w:lang w:val="en"/>
         </w:rPr>
-        <w:t>Limits to check against the Hyper-V to Azure support matrix: BitLocker must be disabled before replication; shared cluster disks, encrypted disks and SMB 3.0 guest storage are not supported; Trusted Launch and confidential VM security types are not supported as targets.</w:t>
+        <w:t xml:space="preserve">Limits to check against the Hyper-V to Azure support matrix: BitLocker must be disabled before replication; shared cluster disks, encrypted disks and SMB 3.0 guest storage are not supported; Trusted Launch and confidential VM security types are not supported as targets. On Azure Local, a </w:t>
+      </w:r>
+      <w:r>
+        <w:rPr>
+          <w:rFonts w:ascii="Segoe UI" w:hAnsi="Segoe UI" w:cs="Segoe UI"/>
+          <w:color w:val="1B2430"/>
+          <w:sz w:val="21"/>
+          <w:szCs w:val="21"/>
+          <w:lang w:val="en"/>
+        </w:rPr>
+        <w:lastRenderedPageBreak/>
+        <w:t>VM created with Trusted launch is not supported by Site Recovery as a source either (Microsoft Learn, Trusted launch for Azure Local VMs): decide the VM security type before you plan Site Recovery for it.</w:t>
       </w:r>
     </w:p>
     <w:p>
@@ -1061,7 +1072,6 @@
           <w:rFonts w:ascii="Segoe UI" w:eastAsia="Times New Roman" w:hAnsi="Segoe UI" w:cs="Segoe UI"/>
           <w:lang w:val="en"/>
         </w:rPr>
-        <w:lastRenderedPageBreak/>
         <w:t>Prerequisites</w:t>
       </w:r>
     </w:p>
@@ -1650,6 +1660,7 @@
           <w:szCs w:val="21"/>
           <w:lang w:val="en"/>
         </w:rPr>
+        <w:lastRenderedPageBreak/>
         <w:t>Validate the application in Azure, not just that the VM booted.</w:t>
       </w:r>
     </w:p>
@@ -1714,7 +1725,6 @@
           <w:rFonts w:ascii="Segoe UI" w:eastAsia="Times New Roman" w:hAnsi="Segoe UI" w:cs="Segoe UI"/>
           <w:lang w:val="en"/>
         </w:rPr>
-        <w:lastRenderedPageBreak/>
         <w:t>Procedure 4: Planned failover to Azure</w:t>
       </w:r>
     </w:p>
@@ -2537,9 +2547,122 @@
 <file path=word/numbering.xml><?xml version="1.0" encoding="utf-8"?>
 <w:numbering xmlns:wpc="http://schemas.microsoft.com/office/word/2010/wordprocessingCanvas" xmlns:cx="http://schemas.microsoft.com/office/drawing/2014/chartex" xmlns:cx1="http://schemas.microsoft.com/office/drawing/2015/9/8/chartex" xmlns:cx2="http://schemas.microsoft.com/office/drawing/2015/10/21/chartex" xmlns:cx3="http://schemas.microsoft.com/office/drawing/2016/5/9/chartex" xmlns:cx4="http://schemas.microsoft.com/office/drawing/2016/5/10/chartex" xmlns:cx5="http://schemas.microsoft.com/office/drawing/2016/5/11/chartex" xmlns:cx6="http://schemas.microsoft.com/office/drawing/2016/5/12/chartex" xmlns:cx7="http://schemas.microsoft.com/office/drawing/2016/5/13/chartex" xmlns:cx8="http://schemas.microsoft.com/office/drawing/2016/5/14/chartex" xmlns:mc="http://schemas.openxmlformats.org/markup-compatibility/2006" xmlns:aink="http://schemas.microsoft.com/office/drawing/2016/ink" xmlns:am3d="http://schemas.microsoft.com/office/drawing/2017/model3d" xmlns:o="urn:schemas-microsoft-com:office:office" xmlns:oel="http://schemas.microsoft.com/office/2019/extlst" xmlns:r="http://schemas.openxmlformats.org/officeDocument/2006/relationships" xmlns:m="http://schemas.openxmlformats.org/officeDocument/2006/math" xmlns:v="urn:schemas-microsoft-com:vml" xmlns:wp14="http://schemas.microsoft.com/office/word/2010/wordprocessingDrawing" xmlns:wp="http://schemas.openxmlformats.org/drawingml/2006/wordprocessingDrawing" xmlns:w10="urn:schemas-microsoft-com:office:word" xmlns:w="http://schemas.openxmlformats.org/wordprocessingml/2006/main" xmlns:w14="http://schemas.microsoft.com/office/word/2010/wordml" xmlns:w15="http://schemas.microsoft.com/office/word/2012/wordml" xmlns:w16cex="http://schemas.microsoft.com/office/word/2018/wordml/cex" xmlns:w16cid="http://schemas.microsoft.com/office/word/2016/wordml/cid" xmlns:w16="http://schemas.microsoft.com/office/word/2018/wordml" xmlns:w16du="http://schemas.microsoft.com/office/word/2023/wordml/word16du" xmlns:w16sdtdh="http://schemas.microsoft.com/office/word/2020/wordml/sdtdatahash" xmlns:w16sdtfl="http://schemas.microsoft.com/office/word/2024/wordml/sdtformatlock" xmlns:w16se="http://schemas.microsoft.com/office/word/2015/wordml/symex" xmlns:wpg="http://schemas.microsoft.com/office/word/2010/wordprocessingGroup" xmlns:wpi="http://schemas.microsoft.com/office/word/2010/wordprocessingInk" xmlns:wne="http://schemas.microsoft.com/office/word/2006/wordml" xmlns:wps="http://schemas.microsoft.com/office/word/2010/wordprocessingShape" mc:Ignorable="w14 w15 w16se w16cid w16 w16cex w16sdtdh w16sdtfl w16du wp14">
   <w:abstractNum w:abstractNumId="0" w15:restartNumberingAfterBreak="0">
-    <w:nsid w:val="1F826CE4"/>
+    <w:nsid w:val="08973995"/>
     <w:multiLevelType w:val="multilevel"/>
-    <w:tmpl w:val="6A3AC602"/>
+    <w:tmpl w:val="B1A81F12"/>
+    <w:lvl w:ilvl="0">
+      <w:start w:val="1"/>
+      <w:numFmt w:val="decimal"/>
+      <w:lvlText w:val="%1."/>
+      <w:lvlJc w:val="left"/>
+      <w:pPr>
+        <w:tabs>
+          <w:tab w:val="num" w:pos="720"/>
+        </w:tabs>
+        <w:ind w:left="720" w:hanging="360"/>
+      </w:pPr>
+    </w:lvl>
+    <w:lvl w:ilvl="1" w:tentative="1">
+      <w:start w:val="1"/>
+      <w:numFmt w:val="decimal"/>
+      <w:lvlText w:val="%2."/>
+      <w:lvlJc w:val="left"/>
+      <w:pPr>
+        <w:tabs>
+          <w:tab w:val="num" w:pos="1440"/>
+        </w:tabs>
+        <w:ind w:left="1440" w:hanging="360"/>
+      </w:pPr>
+    </w:lvl>
+    <w:lvl w:ilvl="2" w:tentative="1">
+      <w:start w:val="1"/>
+      <w:numFmt w:val="decimal"/>
+      <w:lvlText w:val="%3."/>
+      <w:lvlJc w:val="left"/>
+      <w:pPr>
+        <w:tabs>
+          <w:tab w:val="num" w:pos="2160"/>
+        </w:tabs>
+        <w:ind w:left="2160" w:hanging="360"/>
+      </w:pPr>
+    </w:lvl>
+    <w:lvl w:ilvl="3" w:tentative="1">
+      <w:start w:val="1"/>
+      <w:numFmt w:val="decimal"/>
+      <w:lvlText w:val="%4."/>
+      <w:lvlJc w:val="left"/>
+      <w:pPr>
+        <w:tabs>
+          <w:tab w:val="num" w:pos="2880"/>
+        </w:tabs>
+        <w:ind w:left="2880" w:hanging="360"/>
+      </w:pPr>
+    </w:lvl>
+    <w:lvl w:ilvl="4" w:tentative="1">
+      <w:start w:val="1"/>
+      <w:numFmt w:val="decimal"/>
+      <w:lvlText w:val="%5."/>
+      <w:lvlJc w:val="left"/>
+      <w:pPr>
+        <w:tabs>
+          <w:tab w:val="num" w:pos="3600"/>
+        </w:tabs>
+        <w:ind w:left="3600" w:hanging="360"/>
+      </w:pPr>
+    </w:lvl>
+    <w:lvl w:ilvl="5" w:tentative="1">
+      <w:start w:val="1"/>
+      <w:numFmt w:val="decimal"/>
+      <w:lvlText w:val="%6."/>
+      <w:lvlJc w:val="left"/>
+      <w:pPr>
+        <w:tabs>
+          <w:tab w:val="num" w:pos="4320"/>
+        </w:tabs>
+        <w:ind w:left="4320" w:hanging="360"/>
+      </w:pPr>
+    </w:lvl>
+    <w:lvl w:ilvl="6" w:tentative="1">
+      <w:start w:val="1"/>
+      <w:numFmt w:val="decimal"/>
+      <w:lvlText w:val="%7."/>
+      <w:lvlJc w:val="left"/>
+      <w:pPr>
+        <w:tabs>
+          <w:tab w:val="num" w:pos="5040"/>
+        </w:tabs>
+        <w:ind w:left="5040" w:hanging="360"/>
+      </w:pPr>
+    </w:lvl>
+    <w:lvl w:ilvl="7" w:tentative="1">
+      <w:start w:val="1"/>
+      <w:numFmt w:val="decimal"/>
+      <w:lvlText w:val="%8."/>
+      <w:lvlJc w:val="left"/>
+      <w:pPr>
+        <w:tabs>
+          <w:tab w:val="num" w:pos="5760"/>
+        </w:tabs>
+        <w:ind w:left="5760" w:hanging="360"/>
+      </w:pPr>
+    </w:lvl>
+    <w:lvl w:ilvl="8" w:tentative="1">
+      <w:start w:val="1"/>
+      <w:numFmt w:val="decimal"/>
+      <w:lvlText w:val="%9."/>
+      <w:lvlJc w:val="left"/>
+      <w:pPr>
+        <w:tabs>
+          <w:tab w:val="num" w:pos="6480"/>
+        </w:tabs>
+        <w:ind w:left="6480" w:hanging="360"/>
+      </w:pPr>
+    </w:lvl>
+  </w:abstractNum>
+  <w:abstractNum w:abstractNumId="1" w15:restartNumberingAfterBreak="0">
+    <w:nsid w:val="240D4DE3"/>
+    <w:multiLevelType w:val="multilevel"/>
+    <w:tmpl w:val="615A283C"/>
     <w:lvl w:ilvl="0">
       <w:start w:val="1"/>
       <w:numFmt w:val="bullet"/>
@@ -2685,10 +2808,10 @@
       </w:rPr>
     </w:lvl>
   </w:abstractNum>
-  <w:abstractNum w:abstractNumId="1" w15:restartNumberingAfterBreak="0">
-    <w:nsid w:val="2A732939"/>
+  <w:abstractNum w:abstractNumId="2" w15:restartNumberingAfterBreak="0">
+    <w:nsid w:val="2A302700"/>
     <w:multiLevelType w:val="multilevel"/>
-    <w:tmpl w:val="475E332E"/>
+    <w:tmpl w:val="E51E750C"/>
     <w:lvl w:ilvl="0">
       <w:start w:val="1"/>
       <w:numFmt w:val="decimal"/>
@@ -2798,123 +2921,10 @@
       </w:pPr>
     </w:lvl>
   </w:abstractNum>
-  <w:abstractNum w:abstractNumId="2" w15:restartNumberingAfterBreak="0">
-    <w:nsid w:val="2AE0022A"/>
+  <w:abstractNum w:abstractNumId="3" w15:restartNumberingAfterBreak="0">
+    <w:nsid w:val="3ACD030F"/>
     <w:multiLevelType w:val="multilevel"/>
-    <w:tmpl w:val="880CBB22"/>
-    <w:lvl w:ilvl="0">
-      <w:start w:val="1"/>
-      <w:numFmt w:val="decimal"/>
-      <w:lvlText w:val="%1."/>
-      <w:lvlJc w:val="left"/>
-      <w:pPr>
-        <w:tabs>
-          <w:tab w:val="num" w:pos="720"/>
-        </w:tabs>
-        <w:ind w:left="720" w:hanging="360"/>
-      </w:pPr>
-    </w:lvl>
-    <w:lvl w:ilvl="1" w:tentative="1">
-      <w:start w:val="1"/>
-      <w:numFmt w:val="decimal"/>
-      <w:lvlText w:val="%2."/>
-      <w:lvlJc w:val="left"/>
-      <w:pPr>
-        <w:tabs>
-          <w:tab w:val="num" w:pos="1440"/>
-        </w:tabs>
-        <w:ind w:left="1440" w:hanging="360"/>
-      </w:pPr>
-    </w:lvl>
-    <w:lvl w:ilvl="2" w:tentative="1">
-      <w:start w:val="1"/>
-      <w:numFmt w:val="decimal"/>
-      <w:lvlText w:val="%3."/>
-      <w:lvlJc w:val="left"/>
-      <w:pPr>
-        <w:tabs>
-          <w:tab w:val="num" w:pos="2160"/>
-        </w:tabs>
-        <w:ind w:left="2160" w:hanging="360"/>
-      </w:pPr>
-    </w:lvl>
-    <w:lvl w:ilvl="3" w:tentative="1">
-      <w:start w:val="1"/>
-      <w:numFmt w:val="decimal"/>
-      <w:lvlText w:val="%4."/>
-      <w:lvlJc w:val="left"/>
-      <w:pPr>
-        <w:tabs>
-          <w:tab w:val="num" w:pos="2880"/>
-        </w:tabs>
-        <w:ind w:left="2880" w:hanging="360"/>
-      </w:pPr>
-    </w:lvl>
-    <w:lvl w:ilvl="4" w:tentative="1">
-      <w:start w:val="1"/>
-      <w:numFmt w:val="decimal"/>
-      <w:lvlText w:val="%5."/>
-      <w:lvlJc w:val="left"/>
-      <w:pPr>
-        <w:tabs>
-          <w:tab w:val="num" w:pos="3600"/>
-        </w:tabs>
-        <w:ind w:left="3600" w:hanging="360"/>
-      </w:pPr>
-    </w:lvl>
-    <w:lvl w:ilvl="5" w:tentative="1">
-      <w:start w:val="1"/>
-      <w:numFmt w:val="decimal"/>
-      <w:lvlText w:val="%6."/>
-      <w:lvlJc w:val="left"/>
-      <w:pPr>
-        <w:tabs>
-          <w:tab w:val="num" w:pos="4320"/>
-        </w:tabs>
-        <w:ind w:left="4320" w:hanging="360"/>
-      </w:pPr>
-    </w:lvl>
-    <w:lvl w:ilvl="6" w:tentative="1">
-      <w:start w:val="1"/>
-      <w:numFmt w:val="decimal"/>
-      <w:lvlText w:val="%7."/>
-      <w:lvlJc w:val="left"/>
-      <w:pPr>
-        <w:tabs>
-          <w:tab w:val="num" w:pos="5040"/>
-        </w:tabs>
-        <w:ind w:left="5040" w:hanging="360"/>
-      </w:pPr>
-    </w:lvl>
-    <w:lvl w:ilvl="7" w:tentative="1">
-      <w:start w:val="1"/>
-      <w:numFmt w:val="decimal"/>
-      <w:lvlText w:val="%8."/>
-      <w:lvlJc w:val="left"/>
-      <w:pPr>
-        <w:tabs>
-          <w:tab w:val="num" w:pos="5760"/>
-        </w:tabs>
-        <w:ind w:left="5760" w:hanging="360"/>
-      </w:pPr>
-    </w:lvl>
-    <w:lvl w:ilvl="8" w:tentative="1">
-      <w:start w:val="1"/>
-      <w:numFmt w:val="decimal"/>
-      <w:lvlText w:val="%9."/>
-      <w:lvlJc w:val="left"/>
-      <w:pPr>
-        <w:tabs>
-          <w:tab w:val="num" w:pos="6480"/>
-        </w:tabs>
-        <w:ind w:left="6480" w:hanging="360"/>
-      </w:pPr>
-    </w:lvl>
-  </w:abstractNum>
-  <w:abstractNum w:abstractNumId="3" w15:restartNumberingAfterBreak="0">
-    <w:nsid w:val="3DCD145D"/>
-    <w:multiLevelType w:val="multilevel"/>
-    <w:tmpl w:val="B64AE2A0"/>
+    <w:tmpl w:val="9FC856EA"/>
     <w:lvl w:ilvl="0">
       <w:start w:val="1"/>
       <w:numFmt w:val="bullet"/>
@@ -3061,9 +3071,9 @@
     </w:lvl>
   </w:abstractNum>
   <w:abstractNum w:abstractNumId="4" w15:restartNumberingAfterBreak="0">
-    <w:nsid w:val="44F53DFA"/>
+    <w:nsid w:val="551123FA"/>
     <w:multiLevelType w:val="multilevel"/>
-    <w:tmpl w:val="C574AD3E"/>
+    <w:tmpl w:val="AB489782"/>
     <w:lvl w:ilvl="0">
       <w:start w:val="1"/>
       <w:numFmt w:val="decimal"/>
@@ -3174,235 +3184,9 @@
     </w:lvl>
   </w:abstractNum>
   <w:abstractNum w:abstractNumId="5" w15:restartNumberingAfterBreak="0">
-    <w:nsid w:val="57063CBD"/>
+    <w:nsid w:val="555D1F7C"/>
     <w:multiLevelType w:val="multilevel"/>
-    <w:tmpl w:val="B414FD1E"/>
-    <w:lvl w:ilvl="0">
-      <w:start w:val="1"/>
-      <w:numFmt w:val="decimal"/>
-      <w:lvlText w:val="%1."/>
-      <w:lvlJc w:val="left"/>
-      <w:pPr>
-        <w:tabs>
-          <w:tab w:val="num" w:pos="720"/>
-        </w:tabs>
-        <w:ind w:left="720" w:hanging="360"/>
-      </w:pPr>
-    </w:lvl>
-    <w:lvl w:ilvl="1" w:tentative="1">
-      <w:start w:val="1"/>
-      <w:numFmt w:val="decimal"/>
-      <w:lvlText w:val="%2."/>
-      <w:lvlJc w:val="left"/>
-      <w:pPr>
-        <w:tabs>
-          <w:tab w:val="num" w:pos="1440"/>
-        </w:tabs>
-        <w:ind w:left="1440" w:hanging="360"/>
-      </w:pPr>
-    </w:lvl>
-    <w:lvl w:ilvl="2" w:tentative="1">
-      <w:start w:val="1"/>
-      <w:numFmt w:val="decimal"/>
-      <w:lvlText w:val="%3."/>
-      <w:lvlJc w:val="left"/>
-      <w:pPr>
-        <w:tabs>
-          <w:tab w:val="num" w:pos="2160"/>
-        </w:tabs>
-        <w:ind w:left="2160" w:hanging="360"/>
-      </w:pPr>
-    </w:lvl>
-    <w:lvl w:ilvl="3" w:tentative="1">
-      <w:start w:val="1"/>
-      <w:numFmt w:val="decimal"/>
-      <w:lvlText w:val="%4."/>
-      <w:lvlJc w:val="left"/>
-      <w:pPr>
-        <w:tabs>
-          <w:tab w:val="num" w:pos="2880"/>
-        </w:tabs>
-        <w:ind w:left="2880" w:hanging="360"/>
-      </w:pPr>
-    </w:lvl>
-    <w:lvl w:ilvl="4" w:tentative="1">
-      <w:start w:val="1"/>
-      <w:numFmt w:val="decimal"/>
-      <w:lvlText w:val="%5."/>
-      <w:lvlJc w:val="left"/>
-      <w:pPr>
-        <w:tabs>
-          <w:tab w:val="num" w:pos="3600"/>
-        </w:tabs>
-        <w:ind w:left="3600" w:hanging="360"/>
-      </w:pPr>
-    </w:lvl>
-    <w:lvl w:ilvl="5" w:tentative="1">
-      <w:start w:val="1"/>
-      <w:numFmt w:val="decimal"/>
-      <w:lvlText w:val="%6."/>
-      <w:lvlJc w:val="left"/>
-      <w:pPr>
-        <w:tabs>
-          <w:tab w:val="num" w:pos="4320"/>
-        </w:tabs>
-        <w:ind w:left="4320" w:hanging="360"/>
-      </w:pPr>
-    </w:lvl>
-    <w:lvl w:ilvl="6" w:tentative="1">
-      <w:start w:val="1"/>
-      <w:numFmt w:val="decimal"/>
-      <w:lvlText w:val="%7."/>
-      <w:lvlJc w:val="left"/>
-      <w:pPr>
-        <w:tabs>
-          <w:tab w:val="num" w:pos="5040"/>
-        </w:tabs>
-        <w:ind w:left="5040" w:hanging="360"/>
-      </w:pPr>
-    </w:lvl>
-    <w:lvl w:ilvl="7" w:tentative="1">
-      <w:start w:val="1"/>
-      <w:numFmt w:val="decimal"/>
-      <w:lvlText w:val="%8."/>
-      <w:lvlJc w:val="left"/>
-      <w:pPr>
-        <w:tabs>
-          <w:tab w:val="num" w:pos="5760"/>
-        </w:tabs>
-        <w:ind w:left="5760" w:hanging="360"/>
-      </w:pPr>
-    </w:lvl>
-    <w:lvl w:ilvl="8" w:tentative="1">
-      <w:start w:val="1"/>
-      <w:numFmt w:val="decimal"/>
-      <w:lvlText w:val="%9."/>
-      <w:lvlJc w:val="left"/>
-      <w:pPr>
-        <w:tabs>
-          <w:tab w:val="num" w:pos="6480"/>
-        </w:tabs>
-        <w:ind w:left="6480" w:hanging="360"/>
-      </w:pPr>
-    </w:lvl>
-  </w:abstractNum>
-  <w:abstractNum w:abstractNumId="6" w15:restartNumberingAfterBreak="0">
-    <w:nsid w:val="69CA313F"/>
-    <w:multiLevelType w:val="multilevel"/>
-    <w:tmpl w:val="FF3072E2"/>
-    <w:lvl w:ilvl="0">
-      <w:start w:val="1"/>
-      <w:numFmt w:val="decimal"/>
-      <w:lvlText w:val="%1."/>
-      <w:lvlJc w:val="left"/>
-      <w:pPr>
-        <w:tabs>
-          <w:tab w:val="num" w:pos="720"/>
-        </w:tabs>
-        <w:ind w:left="720" w:hanging="360"/>
-      </w:pPr>
-    </w:lvl>
-    <w:lvl w:ilvl="1" w:tentative="1">
-      <w:start w:val="1"/>
-      <w:numFmt w:val="decimal"/>
-      <w:lvlText w:val="%2."/>
-      <w:lvlJc w:val="left"/>
-      <w:pPr>
-        <w:tabs>
-          <w:tab w:val="num" w:pos="1440"/>
-        </w:tabs>
-        <w:ind w:left="1440" w:hanging="360"/>
-      </w:pPr>
-    </w:lvl>
-    <w:lvl w:ilvl="2" w:tentative="1">
-      <w:start w:val="1"/>
-      <w:numFmt w:val="decimal"/>
-      <w:lvlText w:val="%3."/>
-      <w:lvlJc w:val="left"/>
-      <w:pPr>
-        <w:tabs>
-          <w:tab w:val="num" w:pos="2160"/>
-        </w:tabs>
-        <w:ind w:left="2160" w:hanging="360"/>
-      </w:pPr>
-    </w:lvl>
-    <w:lvl w:ilvl="3" w:tentative="1">
-      <w:start w:val="1"/>
-      <w:numFmt w:val="decimal"/>
-      <w:lvlText w:val="%4."/>
-      <w:lvlJc w:val="left"/>
-      <w:pPr>
-        <w:tabs>
-          <w:tab w:val="num" w:pos="2880"/>
-        </w:tabs>
-        <w:ind w:left="2880" w:hanging="360"/>
-      </w:pPr>
-    </w:lvl>
-    <w:lvl w:ilvl="4" w:tentative="1">
-      <w:start w:val="1"/>
-      <w:numFmt w:val="decimal"/>
-      <w:lvlText w:val="%5."/>
-      <w:lvlJc w:val="left"/>
-      <w:pPr>
-        <w:tabs>
-          <w:tab w:val="num" w:pos="3600"/>
-        </w:tabs>
-        <w:ind w:left="3600" w:hanging="360"/>
-      </w:pPr>
-    </w:lvl>
-    <w:lvl w:ilvl="5" w:tentative="1">
-      <w:start w:val="1"/>
-      <w:numFmt w:val="decimal"/>
-      <w:lvlText w:val="%6."/>
-      <w:lvlJc w:val="left"/>
-      <w:pPr>
-        <w:tabs>
-          <w:tab w:val="num" w:pos="4320"/>
-        </w:tabs>
-        <w:ind w:left="4320" w:hanging="360"/>
-      </w:pPr>
-    </w:lvl>
-    <w:lvl w:ilvl="6" w:tentative="1">
-      <w:start w:val="1"/>
-      <w:numFmt w:val="decimal"/>
-      <w:lvlText w:val="%7."/>
-      <w:lvlJc w:val="left"/>
-      <w:pPr>
-        <w:tabs>
-          <w:tab w:val="num" w:pos="5040"/>
-        </w:tabs>
-        <w:ind w:left="5040" w:hanging="360"/>
-      </w:pPr>
-    </w:lvl>
-    <w:lvl w:ilvl="7" w:tentative="1">
-      <w:start w:val="1"/>
-      <w:numFmt w:val="decimal"/>
-      <w:lvlText w:val="%8."/>
-      <w:lvlJc w:val="left"/>
-      <w:pPr>
-        <w:tabs>
-          <w:tab w:val="num" w:pos="5760"/>
-        </w:tabs>
-        <w:ind w:left="5760" w:hanging="360"/>
-      </w:pPr>
-    </w:lvl>
-    <w:lvl w:ilvl="8" w:tentative="1">
-      <w:start w:val="1"/>
-      <w:numFmt w:val="decimal"/>
-      <w:lvlText w:val="%9."/>
-      <w:lvlJc w:val="left"/>
-      <w:pPr>
-        <w:tabs>
-          <w:tab w:val="num" w:pos="6480"/>
-        </w:tabs>
-        <w:ind w:left="6480" w:hanging="360"/>
-      </w:pPr>
-    </w:lvl>
-  </w:abstractNum>
-  <w:abstractNum w:abstractNumId="7" w15:restartNumberingAfterBreak="0">
-    <w:nsid w:val="756A45A0"/>
-    <w:multiLevelType w:val="multilevel"/>
-    <w:tmpl w:val="9F561CB2"/>
+    <w:tmpl w:val="3A5C2382"/>
     <w:lvl w:ilvl="0">
       <w:start w:val="1"/>
       <w:numFmt w:val="bullet"/>
@@ -3548,29 +3332,255 @@
       </w:rPr>
     </w:lvl>
   </w:abstractNum>
-  <w:num w:numId="1" w16cid:durableId="1385367130">
+  <w:abstractNum w:abstractNumId="6" w15:restartNumberingAfterBreak="0">
+    <w:nsid w:val="5A581B14"/>
+    <w:multiLevelType w:val="multilevel"/>
+    <w:tmpl w:val="22709E7E"/>
+    <w:lvl w:ilvl="0">
+      <w:start w:val="1"/>
+      <w:numFmt w:val="decimal"/>
+      <w:lvlText w:val="%1."/>
+      <w:lvlJc w:val="left"/>
+      <w:pPr>
+        <w:tabs>
+          <w:tab w:val="num" w:pos="720"/>
+        </w:tabs>
+        <w:ind w:left="720" w:hanging="360"/>
+      </w:pPr>
+    </w:lvl>
+    <w:lvl w:ilvl="1" w:tentative="1">
+      <w:start w:val="1"/>
+      <w:numFmt w:val="decimal"/>
+      <w:lvlText w:val="%2."/>
+      <w:lvlJc w:val="left"/>
+      <w:pPr>
+        <w:tabs>
+          <w:tab w:val="num" w:pos="1440"/>
+        </w:tabs>
+        <w:ind w:left="1440" w:hanging="360"/>
+      </w:pPr>
+    </w:lvl>
+    <w:lvl w:ilvl="2" w:tentative="1">
+      <w:start w:val="1"/>
+      <w:numFmt w:val="decimal"/>
+      <w:lvlText w:val="%3."/>
+      <w:lvlJc w:val="left"/>
+      <w:pPr>
+        <w:tabs>
+          <w:tab w:val="num" w:pos="2160"/>
+        </w:tabs>
+        <w:ind w:left="2160" w:hanging="360"/>
+      </w:pPr>
+    </w:lvl>
+    <w:lvl w:ilvl="3" w:tentative="1">
+      <w:start w:val="1"/>
+      <w:numFmt w:val="decimal"/>
+      <w:lvlText w:val="%4."/>
+      <w:lvlJc w:val="left"/>
+      <w:pPr>
+        <w:tabs>
+          <w:tab w:val="num" w:pos="2880"/>
+        </w:tabs>
+        <w:ind w:left="2880" w:hanging="360"/>
+      </w:pPr>
+    </w:lvl>
+    <w:lvl w:ilvl="4" w:tentative="1">
+      <w:start w:val="1"/>
+      <w:numFmt w:val="decimal"/>
+      <w:lvlText w:val="%5."/>
+      <w:lvlJc w:val="left"/>
+      <w:pPr>
+        <w:tabs>
+          <w:tab w:val="num" w:pos="3600"/>
+        </w:tabs>
+        <w:ind w:left="3600" w:hanging="360"/>
+      </w:pPr>
+    </w:lvl>
+    <w:lvl w:ilvl="5" w:tentative="1">
+      <w:start w:val="1"/>
+      <w:numFmt w:val="decimal"/>
+      <w:lvlText w:val="%6."/>
+      <w:lvlJc w:val="left"/>
+      <w:pPr>
+        <w:tabs>
+          <w:tab w:val="num" w:pos="4320"/>
+        </w:tabs>
+        <w:ind w:left="4320" w:hanging="360"/>
+      </w:pPr>
+    </w:lvl>
+    <w:lvl w:ilvl="6" w:tentative="1">
+      <w:start w:val="1"/>
+      <w:numFmt w:val="decimal"/>
+      <w:lvlText w:val="%7."/>
+      <w:lvlJc w:val="left"/>
+      <w:pPr>
+        <w:tabs>
+          <w:tab w:val="num" w:pos="5040"/>
+        </w:tabs>
+        <w:ind w:left="5040" w:hanging="360"/>
+      </w:pPr>
+    </w:lvl>
+    <w:lvl w:ilvl="7" w:tentative="1">
+      <w:start w:val="1"/>
+      <w:numFmt w:val="decimal"/>
+      <w:lvlText w:val="%8."/>
+      <w:lvlJc w:val="left"/>
+      <w:pPr>
+        <w:tabs>
+          <w:tab w:val="num" w:pos="5760"/>
+        </w:tabs>
+        <w:ind w:left="5760" w:hanging="360"/>
+      </w:pPr>
+    </w:lvl>
+    <w:lvl w:ilvl="8" w:tentative="1">
+      <w:start w:val="1"/>
+      <w:numFmt w:val="decimal"/>
+      <w:lvlText w:val="%9."/>
+      <w:lvlJc w:val="left"/>
+      <w:pPr>
+        <w:tabs>
+          <w:tab w:val="num" w:pos="6480"/>
+        </w:tabs>
+        <w:ind w:left="6480" w:hanging="360"/>
+      </w:pPr>
+    </w:lvl>
+  </w:abstractNum>
+  <w:abstractNum w:abstractNumId="7" w15:restartNumberingAfterBreak="0">
+    <w:nsid w:val="62C14537"/>
+    <w:multiLevelType w:val="multilevel"/>
+    <w:tmpl w:val="08ECB286"/>
+    <w:lvl w:ilvl="0">
+      <w:start w:val="1"/>
+      <w:numFmt w:val="decimal"/>
+      <w:lvlText w:val="%1."/>
+      <w:lvlJc w:val="left"/>
+      <w:pPr>
+        <w:tabs>
+          <w:tab w:val="num" w:pos="720"/>
+        </w:tabs>
+        <w:ind w:left="720" w:hanging="360"/>
+      </w:pPr>
+    </w:lvl>
+    <w:lvl w:ilvl="1" w:tentative="1">
+      <w:start w:val="1"/>
+      <w:numFmt w:val="decimal"/>
+      <w:lvlText w:val="%2."/>
+      <w:lvlJc w:val="left"/>
+      <w:pPr>
+        <w:tabs>
+          <w:tab w:val="num" w:pos="1440"/>
+        </w:tabs>
+        <w:ind w:left="1440" w:hanging="360"/>
+      </w:pPr>
+    </w:lvl>
+    <w:lvl w:ilvl="2" w:tentative="1">
+      <w:start w:val="1"/>
+      <w:numFmt w:val="decimal"/>
+      <w:lvlText w:val="%3."/>
+      <w:lvlJc w:val="left"/>
+      <w:pPr>
+        <w:tabs>
+          <w:tab w:val="num" w:pos="2160"/>
+        </w:tabs>
+        <w:ind w:left="2160" w:hanging="360"/>
+      </w:pPr>
+    </w:lvl>
+    <w:lvl w:ilvl="3" w:tentative="1">
+      <w:start w:val="1"/>
+      <w:numFmt w:val="decimal"/>
+      <w:lvlText w:val="%4."/>
+      <w:lvlJc w:val="left"/>
+      <w:pPr>
+        <w:tabs>
+          <w:tab w:val="num" w:pos="2880"/>
+        </w:tabs>
+        <w:ind w:left="2880" w:hanging="360"/>
+      </w:pPr>
+    </w:lvl>
+    <w:lvl w:ilvl="4" w:tentative="1">
+      <w:start w:val="1"/>
+      <w:numFmt w:val="decimal"/>
+      <w:lvlText w:val="%5."/>
+      <w:lvlJc w:val="left"/>
+      <w:pPr>
+        <w:tabs>
+          <w:tab w:val="num" w:pos="3600"/>
+        </w:tabs>
+        <w:ind w:left="3600" w:hanging="360"/>
+      </w:pPr>
+    </w:lvl>
+    <w:lvl w:ilvl="5" w:tentative="1">
+      <w:start w:val="1"/>
+      <w:numFmt w:val="decimal"/>
+      <w:lvlText w:val="%6."/>
+      <w:lvlJc w:val="left"/>
+      <w:pPr>
+        <w:tabs>
+          <w:tab w:val="num" w:pos="4320"/>
+        </w:tabs>
+        <w:ind w:left="4320" w:hanging="360"/>
+      </w:pPr>
+    </w:lvl>
+    <w:lvl w:ilvl="6" w:tentative="1">
+      <w:start w:val="1"/>
+      <w:numFmt w:val="decimal"/>
+      <w:lvlText w:val="%7."/>
+      <w:lvlJc w:val="left"/>
+      <w:pPr>
+        <w:tabs>
+          <w:tab w:val="num" w:pos="5040"/>
+        </w:tabs>
+        <w:ind w:left="5040" w:hanging="360"/>
+      </w:pPr>
+    </w:lvl>
+    <w:lvl w:ilvl="7" w:tentative="1">
+      <w:start w:val="1"/>
+      <w:numFmt w:val="decimal"/>
+      <w:lvlText w:val="%8."/>
+      <w:lvlJc w:val="left"/>
+      <w:pPr>
+        <w:tabs>
+          <w:tab w:val="num" w:pos="5760"/>
+        </w:tabs>
+        <w:ind w:left="5760" w:hanging="360"/>
+      </w:pPr>
+    </w:lvl>
+    <w:lvl w:ilvl="8" w:tentative="1">
+      <w:start w:val="1"/>
+      <w:numFmt w:val="decimal"/>
+      <w:lvlText w:val="%9."/>
+      <w:lvlJc w:val="left"/>
+      <w:pPr>
+        <w:tabs>
+          <w:tab w:val="num" w:pos="6480"/>
+        </w:tabs>
+        <w:ind w:left="6480" w:hanging="360"/>
+      </w:pPr>
+    </w:lvl>
+  </w:abstractNum>
+  <w:num w:numId="1" w16cid:durableId="1468669185">
     <w:abstractNumId w:val="3"/>
   </w:num>
-  <w:num w:numId="2" w16cid:durableId="1503275879">
+  <w:num w:numId="2" w16cid:durableId="821845875">
+    <w:abstractNumId w:val="7"/>
+  </w:num>
+  <w:num w:numId="3" w16cid:durableId="705450605">
+    <w:abstractNumId w:val="0"/>
+  </w:num>
+  <w:num w:numId="4" w16cid:durableId="1984119754">
+    <w:abstractNumId w:val="4"/>
+  </w:num>
+  <w:num w:numId="5" w16cid:durableId="1540242690">
     <w:abstractNumId w:val="6"/>
   </w:num>
-  <w:num w:numId="3" w16cid:durableId="1989312128">
+  <w:num w:numId="6" w16cid:durableId="2006400389">
+    <w:abstractNumId w:val="2"/>
+  </w:num>
+  <w:num w:numId="7" w16cid:durableId="1396857272">
     <w:abstractNumId w:val="5"/>
   </w:num>
-  <w:num w:numId="4" w16cid:durableId="1516457716">
-    <w:abstractNumId w:val="4"/>
-  </w:num>
-  <w:num w:numId="5" w16cid:durableId="1254169785">
-    <w:abstractNumId w:val="2"/>
-  </w:num>
-  <w:num w:numId="6" w16cid:durableId="1620182599">
+  <w:num w:numId="8" w16cid:durableId="112291480">
     <w:abstractNumId w:val="1"/>
-  </w:num>
-  <w:num w:numId="7" w16cid:durableId="537594734">
-    <w:abstractNumId w:val="7"/>
-  </w:num>
-  <w:num w:numId="8" w16cid:durableId="1989049511">
-    <w:abstractNumId w:val="0"/>
   </w:num>
 </w:numbering>
 </file>

</xml_diff>

<commit_message>
Attendee material regenerated (13 Oct, final): deck with the Site Recovery results and the voyage wording throughout, Site Recovery failover handout as PDF, Word and Markdown, follow-along site content and header stripe
Co-Authored-By: Claude Opus 5.5 <noreply@anthropic.com>
</commit_message>
<xml_diff>
--- a/handouts/ASR_Failover_Procedures.docx
+++ b/handouts/ASR_Failover_Procedures.docx
@@ -70,7 +70,7 @@
           <w:szCs w:val="21"/>
           <w:lang w:val="en"/>
         </w:rPr>
-        <w:t xml:space="preserve"> prepared 2026-10-06 against Microsoft Learn (2609 release family). </w:t>
+        <w:t xml:space="preserve"> prepared 2026-10-06 against Microsoft Learn (2609 release family); lab-tested 2026-10-13 (replication, test failover, cleanup). </w:t>
       </w:r>
       <w:r>
         <w:rPr>
@@ -112,7 +112,17 @@
           <w:szCs w:val="21"/>
           <w:lang w:val="en"/>
         </w:rPr>
-        <w:t xml:space="preserve"> and applicable to test environments. For production, configure Site Recovery manually with the </w:t>
+        <w:t xml:space="preserve"> </w:t>
+      </w:r>
+      <w:r>
+        <w:rPr>
+          <w:rFonts w:ascii="Segoe UI" w:hAnsi="Segoe UI" w:cs="Segoe UI"/>
+          <w:color w:val="1B2430"/>
+          <w:sz w:val="21"/>
+          <w:szCs w:val="21"/>
+          <w:lang w:val="en"/>
+        </w:rPr>
+        <w:t xml:space="preserve">and applicable to test environments. For production, configure Site Recovery manually with the </w:t>
       </w:r>
       <w:r>
         <w:rPr>
@@ -1344,18 +1354,71 @@
     </w:p>
     <w:p>
       <w:pPr>
-        <w:pStyle w:val="Heading2"/>
-        <w:rPr>
-          <w:rFonts w:ascii="Segoe UI" w:eastAsia="Times New Roman" w:hAnsi="Segoe UI" w:cs="Segoe UI"/>
-          <w:lang w:val="en"/>
-        </w:rPr>
-      </w:pPr>
-      <w:r>
-        <w:rPr>
-          <w:rFonts w:ascii="Segoe UI" w:eastAsia="Times New Roman" w:hAnsi="Segoe UI" w:cs="Segoe UI"/>
-          <w:lang w:val="en"/>
-        </w:rPr>
-        <w:t>Procedure 2: Enable replication</w:t>
+        <w:pStyle w:val="NormalWeb"/>
+        <w:rPr>
+          <w:rFonts w:ascii="Segoe UI" w:hAnsi="Segoe UI" w:cs="Segoe UI"/>
+          <w:color w:val="1B2430"/>
+          <w:sz w:val="21"/>
+          <w:szCs w:val="21"/>
+          <w:lang w:val="en"/>
+        </w:rPr>
+      </w:pPr>
+      <w:r>
+        <w:rPr>
+          <w:rStyle w:val="Strong"/>
+          <w:rFonts w:ascii="Segoe UI" w:hAnsi="Segoe UI" w:cs="Segoe UI"/>
+          <w:color w:val="1B2430"/>
+          <w:sz w:val="21"/>
+          <w:szCs w:val="21"/>
+          <w:lang w:val="en"/>
+        </w:rPr>
+        <w:t>By script instead of the portal.</w:t>
+      </w:r>
+      <w:r>
+        <w:rPr>
+          <w:rFonts w:ascii="Segoe UI" w:hAnsi="Segoe UI" w:cs="Segoe UI"/>
+          <w:color w:val="1B2430"/>
+          <w:sz w:val="21"/>
+          <w:szCs w:val="21"/>
+          <w:lang w:val="en"/>
+        </w:rPr>
+        <w:t xml:space="preserve"> Microsoft documents the same agent as a cluster extension (Azure Arc extension management on Azure Local: publisher </w:t>
+      </w:r>
+      <w:r>
+        <w:rPr>
+          <w:rStyle w:val="HTMLCode"/>
+          <w:color w:val="1B2430"/>
+          <w:lang w:val="en"/>
+        </w:rPr>
+        <w:t>Microsoft.SiteRecovery.Dra</w:t>
+      </w:r>
+      <w:r>
+        <w:rPr>
+          <w:rFonts w:ascii="Segoe UI" w:hAnsi="Segoe UI" w:cs="Segoe UI"/>
+          <w:color w:val="1B2430"/>
+          <w:sz w:val="21"/>
+          <w:szCs w:val="21"/>
+          <w:lang w:val="en"/>
+        </w:rPr>
+        <w:t xml:space="preserve">, type </w:t>
+      </w:r>
+      <w:r>
+        <w:rPr>
+          <w:rStyle w:val="HTMLCode"/>
+          <w:color w:val="1B2430"/>
+          <w:lang w:val="en"/>
+        </w:rPr>
+        <w:t>Windows</w:t>
+      </w:r>
+      <w:r>
+        <w:rPr>
+          <w:rFonts w:ascii="Segoe UI" w:hAnsi="Segoe UI" w:cs="Segoe UI"/>
+          <w:color w:val="1B2430"/>
+          <w:sz w:val="21"/>
+          <w:szCs w:val="21"/>
+          <w:lang w:val="en"/>
+        </w:rPr>
+        <w:t>, with the vault, Hyper-V site and policy in its settings). Create the Hyper-V site in the vault first (its internal identifier is the extension's site ID), then:</w:t>
       </w:r>
     </w:p>
     <w:p>
@@ -1381,7 +1444,7 @@
           <w:szCs w:val="21"/>
           <w:lang w:val="en"/>
         </w:rPr>
-        <w:t xml:space="preserve">From the vault, select </w:t>
+        <w:t xml:space="preserve">give the </w:t>
       </w:r>
       <w:r>
         <w:rPr>
@@ -1392,38 +1455,38 @@
           <w:szCs w:val="21"/>
           <w:lang w:val="en"/>
         </w:rPr>
-        <w:t>Replicate</w:t>
-      </w:r>
-      <w:r>
-        <w:rPr>
-          <w:rFonts w:ascii="Segoe UI" w:eastAsia="Times New Roman" w:hAnsi="Segoe UI" w:cs="Segoe UI"/>
-          <w:color w:val="1B2430"/>
-          <w:sz w:val="21"/>
-          <w:szCs w:val="21"/>
-          <w:lang w:val="en"/>
-        </w:rPr>
-        <w:t xml:space="preserve">, then </w:t>
-      </w:r>
-      <w:r>
-        <w:rPr>
-          <w:rStyle w:val="Strong"/>
-          <w:rFonts w:ascii="Segoe UI" w:eastAsia="Times New Roman" w:hAnsi="Segoe UI" w:cs="Segoe UI"/>
-          <w:color w:val="1B2430"/>
-          <w:sz w:val="21"/>
-          <w:szCs w:val="21"/>
-          <w:lang w:val="en"/>
-        </w:rPr>
-        <w:t>Hyper-V machines to Azure</w:t>
-      </w:r>
-      <w:r>
-        <w:rPr>
-          <w:rFonts w:ascii="Segoe UI" w:eastAsia="Times New Roman" w:hAnsi="Segoe UI" w:cs="Segoe UI"/>
-          <w:color w:val="1B2430"/>
-          <w:sz w:val="21"/>
-          <w:szCs w:val="21"/>
-          <w:lang w:val="en"/>
-        </w:rPr>
-        <w:t>.</w:t>
+        <w:t>Azure Local cluster resource's</w:t>
+      </w:r>
+      <w:r>
+        <w:rPr>
+          <w:rFonts w:ascii="Segoe UI" w:eastAsia="Times New Roman" w:hAnsi="Segoe UI" w:cs="Segoe UI"/>
+          <w:color w:val="1B2430"/>
+          <w:sz w:val="21"/>
+          <w:szCs w:val="21"/>
+          <w:lang w:val="en"/>
+        </w:rPr>
+        <w:t xml:space="preserve"> managed identity </w:t>
+      </w:r>
+      <w:r>
+        <w:rPr>
+          <w:rStyle w:val="Emphasis"/>
+          <w:rFonts w:ascii="Segoe UI" w:eastAsia="Times New Roman" w:hAnsi="Segoe UI" w:cs="Segoe UI"/>
+          <w:color w:val="1B2430"/>
+          <w:sz w:val="21"/>
+          <w:szCs w:val="21"/>
+          <w:lang w:val="en"/>
+        </w:rPr>
+        <w:t>Site Recovery Contributor</w:t>
+      </w:r>
+      <w:r>
+        <w:rPr>
+          <w:rFonts w:ascii="Segoe UI" w:eastAsia="Times New Roman" w:hAnsi="Segoe UI" w:cs="Segoe UI"/>
+          <w:color w:val="1B2430"/>
+          <w:sz w:val="21"/>
+          <w:szCs w:val="21"/>
+          <w:lang w:val="en"/>
+        </w:rPr>
+        <w:t xml:space="preserve"> on the vault: the extension fetches the vault registration key with that identity, not with the machines' identities;</w:t>
       </w:r>
     </w:p>
     <w:p>
@@ -1449,7 +1512,80 @@
           <w:szCs w:val="21"/>
           <w:lang w:val="en"/>
         </w:rPr>
-        <w:t>Choose the Hyper-V site on the Azure Local resource as the source.</w:t>
+        <w:t xml:space="preserve">give the </w:t>
+      </w:r>
+      <w:r>
+        <w:rPr>
+          <w:rStyle w:val="Strong"/>
+          <w:rFonts w:ascii="Segoe UI" w:eastAsia="Times New Roman" w:hAnsi="Segoe UI" w:cs="Segoe UI"/>
+          <w:color w:val="1B2430"/>
+          <w:sz w:val="21"/>
+          <w:szCs w:val="21"/>
+          <w:lang w:val="en"/>
+        </w:rPr>
+        <w:t>vault's</w:t>
+      </w:r>
+      <w:r>
+        <w:rPr>
+          <w:rFonts w:ascii="Segoe UI" w:eastAsia="Times New Roman" w:hAnsi="Segoe UI" w:cs="Segoe UI"/>
+          <w:color w:val="1B2430"/>
+          <w:sz w:val="21"/>
+          <w:szCs w:val="21"/>
+          <w:lang w:val="en"/>
+        </w:rPr>
+        <w:t xml:space="preserve"> managed identity </w:t>
+      </w:r>
+      <w:r>
+        <w:rPr>
+          <w:rStyle w:val="Emphasis"/>
+          <w:rFonts w:ascii="Segoe UI" w:eastAsia="Times New Roman" w:hAnsi="Segoe UI" w:cs="Segoe UI"/>
+          <w:color w:val="1B2430"/>
+          <w:sz w:val="21"/>
+          <w:szCs w:val="21"/>
+          <w:lang w:val="en"/>
+        </w:rPr>
+        <w:t>Contributor</w:t>
+      </w:r>
+      <w:r>
+        <w:rPr>
+          <w:rFonts w:ascii="Segoe UI" w:eastAsia="Times New Roman" w:hAnsi="Segoe UI" w:cs="Segoe UI"/>
+          <w:color w:val="1B2430"/>
+          <w:sz w:val="21"/>
+          <w:szCs w:val="21"/>
+          <w:lang w:val="en"/>
+        </w:rPr>
+        <w:t xml:space="preserve"> and </w:t>
+      </w:r>
+      <w:r>
+        <w:rPr>
+          <w:rStyle w:val="Emphasis"/>
+          <w:rFonts w:ascii="Segoe UI" w:eastAsia="Times New Roman" w:hAnsi="Segoe UI" w:cs="Segoe UI"/>
+          <w:color w:val="1B2430"/>
+          <w:sz w:val="21"/>
+          <w:szCs w:val="21"/>
+          <w:lang w:val="en"/>
+        </w:rPr>
+        <w:t>Storage Blob Data Contributor</w:t>
+      </w:r>
+      <w:r>
+        <w:rPr>
+          <w:rFonts w:ascii="Segoe UI" w:eastAsia="Times New Roman" w:hAnsi="Segoe UI" w:cs="Segoe UI"/>
+          <w:color w:val="1B2430"/>
+          <w:sz w:val="21"/>
+          <w:szCs w:val="21"/>
+          <w:lang w:val="en"/>
+        </w:rPr>
+        <w:t xml:space="preserve"> </w:t>
+      </w:r>
+      <w:r>
+        <w:rPr>
+          <w:rFonts w:ascii="Segoe UI" w:eastAsia="Times New Roman" w:hAnsi="Segoe UI" w:cs="Segoe UI"/>
+          <w:color w:val="1B2430"/>
+          <w:sz w:val="21"/>
+          <w:szCs w:val="21"/>
+          <w:lang w:val="en"/>
+        </w:rPr>
+        <w:t>on the cache storage account (Standard account) before you enable replication to managed disks;</w:t>
       </w:r>
     </w:p>
     <w:p>
@@ -1475,7 +1611,7 @@
           <w:szCs w:val="21"/>
           <w:lang w:val="en"/>
         </w:rPr>
-        <w:t>Choose the subscription, the post-failover resource group, the Resource Manager deployment model, and managed disks for storage. Choose the Azure network now or later.</w:t>
+        <w:t>install the extension (it installs on every machine; no restart was needed in our lab), wait until every machine reports success, then associate the replication policy with the site;</w:t>
       </w:r>
     </w:p>
     <w:p>
@@ -1501,55 +1637,7 @@
           <w:szCs w:val="21"/>
           <w:lang w:val="en"/>
         </w:rPr>
-        <w:t>Select the VMs, the operating system disk and data disks, and the replication policy.</w:t>
-      </w:r>
-    </w:p>
-    <w:p>
-      <w:pPr>
-        <w:numPr>
-          <w:ilvl w:val="0"/>
-          <w:numId w:val="3"/>
-        </w:numPr>
-        <w:spacing w:after="100"/>
-        <w:rPr>
-          <w:rFonts w:ascii="Segoe UI" w:eastAsia="Times New Roman" w:hAnsi="Segoe UI" w:cs="Segoe UI"/>
-          <w:color w:val="1B2430"/>
-          <w:sz w:val="21"/>
-          <w:szCs w:val="21"/>
-          <w:lang w:val="en"/>
-        </w:rPr>
-      </w:pPr>
-      <w:r>
-        <w:rPr>
-          <w:rFonts w:ascii="Segoe UI" w:eastAsia="Times New Roman" w:hAnsi="Segoe UI" w:cs="Segoe UI"/>
-          <w:color w:val="1B2430"/>
-          <w:sz w:val="21"/>
-          <w:szCs w:val="21"/>
-          <w:lang w:val="en"/>
-        </w:rPr>
-        <w:t>Review and enable replication.</w:t>
-      </w:r>
-    </w:p>
-    <w:p>
-      <w:pPr>
-        <w:pStyle w:val="NormalWeb"/>
-        <w:rPr>
-          <w:rFonts w:ascii="Segoe UI" w:hAnsi="Segoe UI" w:cs="Segoe UI"/>
-          <w:color w:val="1B2430"/>
-          <w:sz w:val="21"/>
-          <w:szCs w:val="21"/>
-          <w:lang w:val="en"/>
-        </w:rPr>
-      </w:pPr>
-      <w:r>
-        <w:rPr>
-          <w:rFonts w:ascii="Segoe UI" w:hAnsi="Segoe UI" w:cs="Segoe UI"/>
-          <w:color w:val="1B2430"/>
-          <w:sz w:val="21"/>
-          <w:szCs w:val="21"/>
-          <w:lang w:val="en"/>
-        </w:rPr>
-        <w:t>Evidence: the replicated item shows initial replication complete, replication health healthy and a recent recovery point. Set the target network and size under Compute and Network.</w:t>
+        <w:t>if a machine reports a failed registration, uninstall the extension and install it again (the documented route); a force-update tag is not honoured for this extension.</w:t>
       </w:r>
     </w:p>
     <w:p>
@@ -1565,29 +1653,7 @@
           <w:rFonts w:ascii="Segoe UI" w:eastAsia="Times New Roman" w:hAnsi="Segoe UI" w:cs="Segoe UI"/>
           <w:lang w:val="en"/>
         </w:rPr>
-        <w:t>Procedure 3: Test failover (quarterly)</w:t>
-      </w:r>
-    </w:p>
-    <w:p>
-      <w:pPr>
-        <w:pStyle w:val="NormalWeb"/>
-        <w:rPr>
-          <w:rFonts w:ascii="Segoe UI" w:hAnsi="Segoe UI" w:cs="Segoe UI"/>
-          <w:color w:val="1B2430"/>
-          <w:sz w:val="21"/>
-          <w:szCs w:val="21"/>
-          <w:lang w:val="en"/>
-        </w:rPr>
-      </w:pPr>
-      <w:r>
-        <w:rPr>
-          <w:rFonts w:ascii="Segoe UI" w:hAnsi="Segoe UI" w:cs="Segoe UI"/>
-          <w:color w:val="1B2430"/>
-          <w:sz w:val="21"/>
-          <w:szCs w:val="21"/>
-          <w:lang w:val="en"/>
-        </w:rPr>
-        <w:t>A test failover creates a VM in Azure on an isolated network without affecting production or replication.</w:t>
+        <w:t>Procedure 2: Enable replication</w:t>
       </w:r>
     </w:p>
     <w:p>
@@ -1613,7 +1679,7 @@
           <w:szCs w:val="21"/>
           <w:lang w:val="en"/>
         </w:rPr>
-        <w:t xml:space="preserve">Open the replicated item and select </w:t>
+        <w:t xml:space="preserve">From the vault, select </w:t>
       </w:r>
       <w:r>
         <w:rPr>
@@ -1624,17 +1690,38 @@
           <w:szCs w:val="21"/>
           <w:lang w:val="en"/>
         </w:rPr>
-        <w:t>Test failover</w:t>
-      </w:r>
-      <w:r>
-        <w:rPr>
-          <w:rFonts w:ascii="Segoe UI" w:eastAsia="Times New Roman" w:hAnsi="Segoe UI" w:cs="Segoe UI"/>
-          <w:color w:val="1B2430"/>
-          <w:sz w:val="21"/>
-          <w:szCs w:val="21"/>
-          <w:lang w:val="en"/>
-        </w:rPr>
-        <w:t>; pick the latest recovery point and the test network.</w:t>
+        <w:t>Replicate</w:t>
+      </w:r>
+      <w:r>
+        <w:rPr>
+          <w:rFonts w:ascii="Segoe UI" w:eastAsia="Times New Roman" w:hAnsi="Segoe UI" w:cs="Segoe UI"/>
+          <w:color w:val="1B2430"/>
+          <w:sz w:val="21"/>
+          <w:szCs w:val="21"/>
+          <w:lang w:val="en"/>
+        </w:rPr>
+        <w:t xml:space="preserve">, then </w:t>
+      </w:r>
+      <w:r>
+        <w:rPr>
+          <w:rStyle w:val="Strong"/>
+          <w:rFonts w:ascii="Segoe UI" w:eastAsia="Times New Roman" w:hAnsi="Segoe UI" w:cs="Segoe UI"/>
+          <w:color w:val="1B2430"/>
+          <w:sz w:val="21"/>
+          <w:szCs w:val="21"/>
+          <w:lang w:val="en"/>
+        </w:rPr>
+        <w:t>Hyper-V machines to Azure</w:t>
+      </w:r>
+      <w:r>
+        <w:rPr>
+          <w:rFonts w:ascii="Segoe UI" w:eastAsia="Times New Roman" w:hAnsi="Segoe UI" w:cs="Segoe UI"/>
+          <w:color w:val="1B2430"/>
+          <w:sz w:val="21"/>
+          <w:szCs w:val="21"/>
+          <w:lang w:val="en"/>
+        </w:rPr>
+        <w:t>.</w:t>
       </w:r>
     </w:p>
     <w:p>
@@ -1660,8 +1747,7 @@
           <w:szCs w:val="21"/>
           <w:lang w:val="en"/>
         </w:rPr>
-        <w:lastRenderedPageBreak/>
-        <w:t>Validate the application in Azure, not just that the VM booted.</w:t>
+        <w:t>Choose the Hyper-V site on the Azure Local resource as the source.</w:t>
       </w:r>
     </w:p>
     <w:p>
@@ -1687,7 +1773,60 @@
           <w:szCs w:val="21"/>
           <w:lang w:val="en"/>
         </w:rPr>
-        <w:t>Clean up the test failover.</w:t>
+        <w:lastRenderedPageBreak/>
+        <w:t>Choose the subscription, the post-failover resource group, the Resource Manager deployment model, and managed disks for storage. Choose the Azure network now or later.</w:t>
+      </w:r>
+    </w:p>
+    <w:p>
+      <w:pPr>
+        <w:numPr>
+          <w:ilvl w:val="0"/>
+          <w:numId w:val="4"/>
+        </w:numPr>
+        <w:spacing w:after="100"/>
+        <w:rPr>
+          <w:rFonts w:ascii="Segoe UI" w:eastAsia="Times New Roman" w:hAnsi="Segoe UI" w:cs="Segoe UI"/>
+          <w:color w:val="1B2430"/>
+          <w:sz w:val="21"/>
+          <w:szCs w:val="21"/>
+          <w:lang w:val="en"/>
+        </w:rPr>
+      </w:pPr>
+      <w:r>
+        <w:rPr>
+          <w:rFonts w:ascii="Segoe UI" w:eastAsia="Times New Roman" w:hAnsi="Segoe UI" w:cs="Segoe UI"/>
+          <w:color w:val="1B2430"/>
+          <w:sz w:val="21"/>
+          <w:szCs w:val="21"/>
+          <w:lang w:val="en"/>
+        </w:rPr>
+        <w:t>Select the VMs, the operating system disk and data disks, and the replication policy.</w:t>
+      </w:r>
+    </w:p>
+    <w:p>
+      <w:pPr>
+        <w:numPr>
+          <w:ilvl w:val="0"/>
+          <w:numId w:val="4"/>
+        </w:numPr>
+        <w:spacing w:after="100"/>
+        <w:rPr>
+          <w:rFonts w:ascii="Segoe UI" w:eastAsia="Times New Roman" w:hAnsi="Segoe UI" w:cs="Segoe UI"/>
+          <w:color w:val="1B2430"/>
+          <w:sz w:val="21"/>
+          <w:szCs w:val="21"/>
+          <w:lang w:val="en"/>
+        </w:rPr>
+      </w:pPr>
+      <w:r>
+        <w:rPr>
+          <w:rFonts w:ascii="Segoe UI" w:eastAsia="Times New Roman" w:hAnsi="Segoe UI" w:cs="Segoe UI"/>
+          <w:color w:val="1B2430"/>
+          <w:sz w:val="21"/>
+          <w:szCs w:val="21"/>
+          <w:lang w:val="en"/>
+        </w:rPr>
+        <w:t>Review and enable replication.</w:t>
       </w:r>
     </w:p>
     <w:p>
@@ -1709,7 +1848,7 @@
           <w:szCs w:val="21"/>
           <w:lang w:val="en"/>
         </w:rPr>
-        <w:t>Evidence: application checks passed, test VM cleaned up, the result recorded.</w:t>
+        <w:t>Evidence: the replicated item shows initial replication complete, replication health healthy and a recent recovery point. Set the target network and size under Compute and Network.</w:t>
       </w:r>
     </w:p>
     <w:p>
@@ -1725,7 +1864,7 @@
           <w:rFonts w:ascii="Segoe UI" w:eastAsia="Times New Roman" w:hAnsi="Segoe UI" w:cs="Segoe UI"/>
           <w:lang w:val="en"/>
         </w:rPr>
-        <w:t>Procedure 4: Planned failover to Azure</w:t>
+        <w:t>Procedure 3: Test failover (quarterly)</w:t>
       </w:r>
     </w:p>
     <w:p>
@@ -1747,7 +1886,7 @@
           <w:szCs w:val="21"/>
           <w:lang w:val="en"/>
         </w:rPr>
-        <w:t>Use it for maintenance, hardware replacement or a controlled move. It gracefully shuts down the source VM so that pending writes are committed to disk and the final changes replicate, which prevents data loss. The no-loss result depends on that final synchronization completing.</w:t>
+        <w:t>A test failover creates a VM in Azure on an isolated network without affecting production or replication.</w:t>
       </w:r>
     </w:p>
     <w:p>
@@ -1773,7 +1912,28 @@
           <w:szCs w:val="21"/>
           <w:lang w:val="en"/>
         </w:rPr>
-        <w:t>Verify replication health, the target network and the recovery plan; confirm there are no snapshots on the VM.</w:t>
+        <w:t xml:space="preserve">Open the replicated item and select </w:t>
+      </w:r>
+      <w:r>
+        <w:rPr>
+          <w:rStyle w:val="Strong"/>
+          <w:rFonts w:ascii="Segoe UI" w:eastAsia="Times New Roman" w:hAnsi="Segoe UI" w:cs="Segoe UI"/>
+          <w:color w:val="1B2430"/>
+          <w:sz w:val="21"/>
+          <w:szCs w:val="21"/>
+          <w:lang w:val="en"/>
+        </w:rPr>
+        <w:t>Test failover</w:t>
+      </w:r>
+      <w:r>
+        <w:rPr>
+          <w:rFonts w:ascii="Segoe UI" w:eastAsia="Times New Roman" w:hAnsi="Segoe UI" w:cs="Segoe UI"/>
+          <w:color w:val="1B2430"/>
+          <w:sz w:val="21"/>
+          <w:szCs w:val="21"/>
+          <w:lang w:val="en"/>
+        </w:rPr>
+        <w:t>; pick the latest recovery point and the test network.</w:t>
       </w:r>
     </w:p>
     <w:p>
@@ -1799,28 +1959,7 @@
           <w:szCs w:val="21"/>
           <w:lang w:val="en"/>
         </w:rPr>
-        <w:t xml:space="preserve">Select </w:t>
-      </w:r>
-      <w:r>
-        <w:rPr>
-          <w:rStyle w:val="Strong"/>
-          <w:rFonts w:ascii="Segoe UI" w:eastAsia="Times New Roman" w:hAnsi="Segoe UI" w:cs="Segoe UI"/>
-          <w:color w:val="1B2430"/>
-          <w:sz w:val="21"/>
-          <w:szCs w:val="21"/>
-          <w:lang w:val="en"/>
-        </w:rPr>
-        <w:t>Failover</w:t>
-      </w:r>
-      <w:r>
-        <w:rPr>
-          <w:rFonts w:ascii="Segoe UI" w:eastAsia="Times New Roman" w:hAnsi="Segoe UI" w:cs="Segoe UI"/>
-          <w:color w:val="1B2430"/>
-          <w:sz w:val="21"/>
-          <w:szCs w:val="21"/>
-          <w:lang w:val="en"/>
-        </w:rPr>
-        <w:t>; choose the latest recovery point; choose to shut down the machine first.</w:t>
+        <w:t>Validate the application in Azure, not just that the VM booted.</w:t>
       </w:r>
     </w:p>
     <w:p>
@@ -1846,70 +1985,7 @@
           <w:szCs w:val="21"/>
           <w:lang w:val="en"/>
         </w:rPr>
-        <w:t>Follow the job. After the first stage, the replica VM appears in Azure. Do not cancel a failover in progress: cancelling stops it and the VM does not replicate again.</w:t>
-      </w:r>
-    </w:p>
-    <w:p>
-      <w:pPr>
-        <w:numPr>
-          <w:ilvl w:val="0"/>
-          <w:numId w:val="5"/>
-        </w:numPr>
-        <w:spacing w:after="100"/>
-        <w:rPr>
-          <w:rFonts w:ascii="Segoe UI" w:eastAsia="Times New Roman" w:hAnsi="Segoe UI" w:cs="Segoe UI"/>
-          <w:color w:val="1B2430"/>
-          <w:sz w:val="21"/>
-          <w:szCs w:val="21"/>
-          <w:lang w:val="en"/>
-        </w:rPr>
-      </w:pPr>
-      <w:r>
-        <w:rPr>
-          <w:rFonts w:ascii="Segoe UI" w:eastAsia="Times New Roman" w:hAnsi="Segoe UI" w:cs="Segoe UI"/>
-          <w:color w:val="1B2430"/>
-          <w:sz w:val="21"/>
-          <w:szCs w:val="21"/>
-          <w:lang w:val="en"/>
-        </w:rPr>
-        <w:t>Validate the application, the target network and the source state.</w:t>
-      </w:r>
-    </w:p>
-    <w:p>
-      <w:pPr>
-        <w:numPr>
-          <w:ilvl w:val="0"/>
-          <w:numId w:val="5"/>
-        </w:numPr>
-        <w:spacing w:after="100"/>
-        <w:rPr>
-          <w:rFonts w:ascii="Segoe UI" w:eastAsia="Times New Roman" w:hAnsi="Segoe UI" w:cs="Segoe UI"/>
-          <w:color w:val="1B2430"/>
-          <w:sz w:val="21"/>
-          <w:szCs w:val="21"/>
-          <w:lang w:val="en"/>
-        </w:rPr>
-      </w:pPr>
-      <w:r>
-        <w:rPr>
-          <w:rStyle w:val="Strong"/>
-          <w:rFonts w:ascii="Segoe UI" w:eastAsia="Times New Roman" w:hAnsi="Segoe UI" w:cs="Segoe UI"/>
-          <w:color w:val="1B2430"/>
-          <w:sz w:val="21"/>
-          <w:szCs w:val="21"/>
-          <w:lang w:val="en"/>
-        </w:rPr>
-        <w:t>Commit</w:t>
-      </w:r>
-      <w:r>
-        <w:rPr>
-          <w:rFonts w:ascii="Segoe UI" w:eastAsia="Times New Roman" w:hAnsi="Segoe UI" w:cs="Segoe UI"/>
-          <w:color w:val="1B2430"/>
-          <w:sz w:val="21"/>
-          <w:szCs w:val="21"/>
-          <w:lang w:val="en"/>
-        </w:rPr>
-        <w:t xml:space="preserve"> the failover. Committing deletes the available recovery points.</w:t>
+        <w:t>Clean up the test failover.</w:t>
       </w:r>
     </w:p>
     <w:p>
@@ -1925,16 +2001,34 @@
       </w:pPr>
       <w:r>
         <w:rPr>
-          <w:rStyle w:val="Strong"/>
           <w:rFonts w:ascii="Segoe UI" w:hAnsi="Segoe UI" w:cs="Segoe UI"/>
           <w:color w:val="1B2430"/>
           <w:sz w:val="21"/>
           <w:szCs w:val="21"/>
           <w:lang w:val="en"/>
         </w:rPr>
-        <w:t>State plainly what a running job proves.</w:t>
-      </w:r>
-      <w:r>
+        <w:t>Evidence: application checks passed, test VM cleaned up, the result recorded.</w:t>
+      </w:r>
+    </w:p>
+    <w:p>
+      <w:pPr>
+        <w:pStyle w:val="Heading2"/>
+        <w:rPr>
+          <w:rFonts w:ascii="Segoe UI" w:eastAsia="Times New Roman" w:hAnsi="Segoe UI" w:cs="Segoe UI"/>
+          <w:lang w:val="en"/>
+        </w:rPr>
+      </w:pPr>
+      <w:r>
+        <w:rPr>
+          <w:rFonts w:ascii="Segoe UI" w:eastAsia="Times New Roman" w:hAnsi="Segoe UI" w:cs="Segoe UI"/>
+          <w:lang w:val="en"/>
+        </w:rPr>
+        <w:t>Procedure 4: Planned failover to Azure</w:t>
+      </w:r>
+    </w:p>
+    <w:p>
+      <w:pPr>
+        <w:pStyle w:val="NormalWeb"/>
         <w:rPr>
           <w:rFonts w:ascii="Segoe UI" w:hAnsi="Segoe UI" w:cs="Segoe UI"/>
           <w:color w:val="1B2430"/>
@@ -1942,12 +2036,8 @@
           <w:szCs w:val="21"/>
           <w:lang w:val="en"/>
         </w:rPr>
-        <w:t xml:space="preserve"> A VM appearing in Azure is not the proof. Application-level validation, the target network, the source state and the path to commit, re-protect and fail back are.</w:t>
-      </w:r>
-    </w:p>
-    <w:p>
-      <w:pPr>
-        <w:pStyle w:val="NormalWeb"/>
+      </w:pPr>
+      <w:r>
         <w:rPr>
           <w:rFonts w:ascii="Segoe UI" w:hAnsi="Segoe UI" w:cs="Segoe UI"/>
           <w:color w:val="1B2430"/>
@@ -1955,32 +2045,7 @@
           <w:szCs w:val="21"/>
           <w:lang w:val="en"/>
         </w:rPr>
-      </w:pPr>
-      <w:r>
-        <w:rPr>
-          <w:rFonts w:ascii="Segoe UI" w:hAnsi="Segoe UI" w:cs="Segoe UI"/>
-          <w:color w:val="1B2430"/>
-          <w:sz w:val="21"/>
-          <w:szCs w:val="21"/>
-          <w:lang w:val="en"/>
-        </w:rPr>
-        <w:t>Failover duration varies with VM size and the hydration process; allow for it in the change window, and do not promise completion inside a fixed short window.</w:t>
-      </w:r>
-    </w:p>
-    <w:p>
-      <w:pPr>
-        <w:pStyle w:val="Heading2"/>
-        <w:rPr>
-          <w:rFonts w:ascii="Segoe UI" w:eastAsia="Times New Roman" w:hAnsi="Segoe UI" w:cs="Segoe UI"/>
-          <w:lang w:val="en"/>
-        </w:rPr>
-      </w:pPr>
-      <w:r>
-        <w:rPr>
-          <w:rFonts w:ascii="Segoe UI" w:eastAsia="Times New Roman" w:hAnsi="Segoe UI" w:cs="Segoe UI"/>
-          <w:lang w:val="en"/>
-        </w:rPr>
-        <w:t>Procedure 5: Re-protect and fail back</w:t>
+        <w:t>Use it for maintenance, hardware replacement or a controlled move. It gracefully shuts down the source VM so that pending writes are committed to disk and the final changes replicate, which prevents data loss. The no-loss result depends on that final synchronization completing.</w:t>
       </w:r>
     </w:p>
     <w:p>
@@ -2006,28 +2071,7 @@
           <w:szCs w:val="21"/>
           <w:lang w:val="en"/>
         </w:rPr>
-        <w:t xml:space="preserve">When the on-premises cluster is healthy, </w:t>
-      </w:r>
-      <w:r>
-        <w:rPr>
-          <w:rStyle w:val="Strong"/>
-          <w:rFonts w:ascii="Segoe UI" w:eastAsia="Times New Roman" w:hAnsi="Segoe UI" w:cs="Segoe UI"/>
-          <w:color w:val="1B2430"/>
-          <w:sz w:val="21"/>
-          <w:szCs w:val="21"/>
-          <w:lang w:val="en"/>
-        </w:rPr>
-        <w:t>re-protect</w:t>
-      </w:r>
-      <w:r>
-        <w:rPr>
-          <w:rFonts w:ascii="Segoe UI" w:eastAsia="Times New Roman" w:hAnsi="Segoe UI" w:cs="Segoe UI"/>
-          <w:color w:val="1B2430"/>
-          <w:sz w:val="21"/>
-          <w:szCs w:val="21"/>
-          <w:lang w:val="en"/>
-        </w:rPr>
-        <w:t xml:space="preserve"> the Azure VM so it replicates back to the cluster. Make sure the on-premises VM is turned off and has no snapshots; do not turn it on during failback.</w:t>
+        <w:t>Verify replication health, the target network and the recovery plan; confirm there are no snapshots on the VM.</w:t>
       </w:r>
     </w:p>
     <w:p>
@@ -2053,7 +2097,7 @@
           <w:szCs w:val="21"/>
           <w:lang w:val="en"/>
         </w:rPr>
-        <w:t xml:space="preserve">Start a </w:t>
+        <w:t xml:space="preserve">Select </w:t>
       </w:r>
       <w:r>
         <w:rPr>
@@ -2064,17 +2108,17 @@
           <w:szCs w:val="21"/>
           <w:lang w:val="en"/>
         </w:rPr>
-        <w:t>planned failover from Azure to on-premises</w:t>
-      </w:r>
-      <w:r>
-        <w:rPr>
-          <w:rFonts w:ascii="Segoe UI" w:eastAsia="Times New Roman" w:hAnsi="Segoe UI" w:cs="Segoe UI"/>
-          <w:color w:val="1B2430"/>
-          <w:sz w:val="21"/>
-          <w:szCs w:val="21"/>
-          <w:lang w:val="en"/>
-        </w:rPr>
-        <w:t>. Choose Minimize downtime (synchronize before failover) or Full download (faster, more downtime, use after a long time in Azure or if the on-premises VM was deleted).</w:t>
+        <w:t>Failover</w:t>
+      </w:r>
+      <w:r>
+        <w:rPr>
+          <w:rFonts w:ascii="Segoe UI" w:eastAsia="Times New Roman" w:hAnsi="Segoe UI" w:cs="Segoe UI"/>
+          <w:color w:val="1B2430"/>
+          <w:sz w:val="21"/>
+          <w:szCs w:val="21"/>
+          <w:lang w:val="en"/>
+        </w:rPr>
+        <w:t>; choose the latest recovery point; choose to shut down the machine first.</w:t>
       </w:r>
     </w:p>
     <w:p>
@@ -2100,28 +2144,7 @@
           <w:szCs w:val="21"/>
           <w:lang w:val="en"/>
         </w:rPr>
-        <w:t xml:space="preserve">After synchronization, complete the failover, check the VM, then </w:t>
-      </w:r>
-      <w:r>
-        <w:rPr>
-          <w:rStyle w:val="Strong"/>
-          <w:rFonts w:ascii="Segoe UI" w:eastAsia="Times New Roman" w:hAnsi="Segoe UI" w:cs="Segoe UI"/>
-          <w:color w:val="1B2430"/>
-          <w:sz w:val="21"/>
-          <w:szCs w:val="21"/>
-          <w:lang w:val="en"/>
-        </w:rPr>
-        <w:t>commit</w:t>
-      </w:r>
-      <w:r>
-        <w:rPr>
-          <w:rFonts w:ascii="Segoe UI" w:eastAsia="Times New Roman" w:hAnsi="Segoe UI" w:cs="Segoe UI"/>
-          <w:color w:val="1B2430"/>
-          <w:sz w:val="21"/>
-          <w:szCs w:val="21"/>
-          <w:lang w:val="en"/>
-        </w:rPr>
-        <w:t>.</w:t>
+        <w:t>Follow the job. After the first stage, the replica VM appears in Azure. Do not cancel a failover in progress: cancelling stops it and the VM does not replicate again.</w:t>
       </w:r>
     </w:p>
     <w:p>
@@ -2141,6 +2164,32 @@
       </w:pPr>
       <w:r>
         <w:rPr>
+          <w:rFonts w:ascii="Segoe UI" w:eastAsia="Times New Roman" w:hAnsi="Segoe UI" w:cs="Segoe UI"/>
+          <w:color w:val="1B2430"/>
+          <w:sz w:val="21"/>
+          <w:szCs w:val="21"/>
+          <w:lang w:val="en"/>
+        </w:rPr>
+        <w:t>Validate the application, the target network and the source state.</w:t>
+      </w:r>
+    </w:p>
+    <w:p>
+      <w:pPr>
+        <w:numPr>
+          <w:ilvl w:val="0"/>
+          <w:numId w:val="6"/>
+        </w:numPr>
+        <w:spacing w:after="100"/>
+        <w:rPr>
+          <w:rFonts w:ascii="Segoe UI" w:eastAsia="Times New Roman" w:hAnsi="Segoe UI" w:cs="Segoe UI"/>
+          <w:color w:val="1B2430"/>
+          <w:sz w:val="21"/>
+          <w:szCs w:val="21"/>
+          <w:lang w:val="en"/>
+        </w:rPr>
+      </w:pPr>
+      <w:r>
+        <w:rPr>
           <w:rStyle w:val="Strong"/>
           <w:rFonts w:ascii="Segoe UI" w:eastAsia="Times New Roman" w:hAnsi="Segoe UI" w:cs="Segoe UI"/>
           <w:color w:val="1B2430"/>
@@ -2148,17 +2197,17 @@
           <w:szCs w:val="21"/>
           <w:lang w:val="en"/>
         </w:rPr>
-        <w:t>Reverse replicate</w:t>
-      </w:r>
-      <w:r>
-        <w:rPr>
-          <w:rFonts w:ascii="Segoe UI" w:eastAsia="Times New Roman" w:hAnsi="Segoe UI" w:cs="Segoe UI"/>
-          <w:color w:val="1B2430"/>
-          <w:sz w:val="21"/>
-          <w:szCs w:val="21"/>
-          <w:lang w:val="en"/>
-        </w:rPr>
-        <w:t xml:space="preserve"> so the VM again replicates to Azure.</w:t>
+        <w:t>Commit</w:t>
+      </w:r>
+      <w:r>
+        <w:rPr>
+          <w:rFonts w:ascii="Segoe UI" w:eastAsia="Times New Roman" w:hAnsi="Segoe UI" w:cs="Segoe UI"/>
+          <w:color w:val="1B2430"/>
+          <w:sz w:val="21"/>
+          <w:szCs w:val="21"/>
+          <w:lang w:val="en"/>
+        </w:rPr>
+        <w:t xml:space="preserve"> the failover. Committing deletes the available recovery points.</w:t>
       </w:r>
     </w:p>
     <w:p>
@@ -2172,16 +2221,6 @@
           <w:lang w:val="en"/>
         </w:rPr>
       </w:pPr>
-      <w:r>
-        <w:rPr>
-          <w:rFonts w:ascii="Segoe UI" w:hAnsi="Segoe UI" w:cs="Segoe UI"/>
-          <w:color w:val="1B2430"/>
-          <w:sz w:val="21"/>
-          <w:szCs w:val="21"/>
-          <w:lang w:val="en"/>
-        </w:rPr>
-        <w:t xml:space="preserve">If the original cluster is unavailable, register another Azure Local cluster to the Site Recovery Hyper-V site and fail back there. The VM returns as an </w:t>
-      </w:r>
       <w:r>
         <w:rPr>
           <w:rStyle w:val="Strong"/>
@@ -2191,7 +2230,7 @@
           <w:szCs w:val="21"/>
           <w:lang w:val="en"/>
         </w:rPr>
-        <w:t>unmanaged VM</w:t>
+        <w:t>State plainly what a running job proves.</w:t>
       </w:r>
       <w:r>
         <w:rPr>
@@ -2201,7 +2240,29 @@
           <w:szCs w:val="21"/>
           <w:lang w:val="en"/>
         </w:rPr>
-        <w:t>: its services run, but it cannot be managed from Azure until it is registered on the new cluster and reconnected to its Azure resource (with the new resource group, custom location, storage path and logical network). Failing back to the same cluster restores the Azure connection within the Arc agent's 45-day reconnection window.</w:t>
+        <w:t xml:space="preserve"> A VM appearing in Azure is not the proof. Application-level validation, the target network, the source state and the path to commit, re-protect and fail back are.</w:t>
+      </w:r>
+    </w:p>
+    <w:p>
+      <w:pPr>
+        <w:pStyle w:val="NormalWeb"/>
+        <w:rPr>
+          <w:rFonts w:ascii="Segoe UI" w:hAnsi="Segoe UI" w:cs="Segoe UI"/>
+          <w:color w:val="1B2430"/>
+          <w:sz w:val="21"/>
+          <w:szCs w:val="21"/>
+          <w:lang w:val="en"/>
+        </w:rPr>
+      </w:pPr>
+      <w:r>
+        <w:rPr>
+          <w:rFonts w:ascii="Segoe UI" w:hAnsi="Segoe UI" w:cs="Segoe UI"/>
+          <w:color w:val="1B2430"/>
+          <w:sz w:val="21"/>
+          <w:szCs w:val="21"/>
+          <w:lang w:val="en"/>
+        </w:rPr>
+        <w:t>Failover duration varies with VM size and the hydration process; allow for it in the change window, and do not promise completion inside a fixed short window.</w:t>
       </w:r>
     </w:p>
     <w:p>
@@ -2217,7 +2278,7 @@
           <w:rFonts w:ascii="Segoe UI" w:eastAsia="Times New Roman" w:hAnsi="Segoe UI" w:cs="Segoe UI"/>
           <w:lang w:val="en"/>
         </w:rPr>
-        <w:t>Caveats to put in the design record</w:t>
+        <w:t>Procedure 5: Re-protect and fail back</w:t>
       </w:r>
     </w:p>
     <w:p>
@@ -2243,7 +2304,38 @@
           <w:szCs w:val="21"/>
           <w:lang w:val="en"/>
         </w:rPr>
-        <w:t>Arc extensions are not visible or manageable on the Azure VM while it runs in Azure.</w:t>
+        <w:t xml:space="preserve">When the on-premises cluster is healthy, </w:t>
+      </w:r>
+      <w:r>
+        <w:rPr>
+          <w:rStyle w:val="Strong"/>
+          <w:rFonts w:ascii="Segoe UI" w:eastAsia="Times New Roman" w:hAnsi="Segoe UI" w:cs="Segoe UI"/>
+          <w:color w:val="1B2430"/>
+          <w:sz w:val="21"/>
+          <w:szCs w:val="21"/>
+          <w:lang w:val="en"/>
+        </w:rPr>
+        <w:t>re-protect</w:t>
+      </w:r>
+      <w:r>
+        <w:rPr>
+          <w:rFonts w:ascii="Segoe UI" w:eastAsia="Times New Roman" w:hAnsi="Segoe UI" w:cs="Segoe UI"/>
+          <w:color w:val="1B2430"/>
+          <w:sz w:val="21"/>
+          <w:szCs w:val="21"/>
+          <w:lang w:val="en"/>
+        </w:rPr>
+        <w:t xml:space="preserve"> </w:t>
+      </w:r>
+      <w:r>
+        <w:rPr>
+          <w:rFonts w:ascii="Segoe UI" w:eastAsia="Times New Roman" w:hAnsi="Segoe UI" w:cs="Segoe UI"/>
+          <w:color w:val="1B2430"/>
+          <w:sz w:val="21"/>
+          <w:szCs w:val="21"/>
+          <w:lang w:val="en"/>
+        </w:rPr>
+        <w:t>the Azure VM so it replicates back to the cluster. Make sure the on-premises VM is turned off and has no snapshots; do not turn it on during failback.</w:t>
       </w:r>
     </w:p>
     <w:p>
@@ -2269,7 +2361,28 @@
           <w:szCs w:val="21"/>
           <w:lang w:val="en"/>
         </w:rPr>
-        <w:t>Guest Configuration policies do not run while the machine is in Azure.</w:t>
+        <w:t xml:space="preserve">Start a </w:t>
+      </w:r>
+      <w:r>
+        <w:rPr>
+          <w:rStyle w:val="Strong"/>
+          <w:rFonts w:ascii="Segoe UI" w:eastAsia="Times New Roman" w:hAnsi="Segoe UI" w:cs="Segoe UI"/>
+          <w:color w:val="1B2430"/>
+          <w:sz w:val="21"/>
+          <w:szCs w:val="21"/>
+          <w:lang w:val="en"/>
+        </w:rPr>
+        <w:t>planned failover from Azure to on-premises</w:t>
+      </w:r>
+      <w:r>
+        <w:rPr>
+          <w:rFonts w:ascii="Segoe UI" w:eastAsia="Times New Roman" w:hAnsi="Segoe UI" w:cs="Segoe UI"/>
+          <w:color w:val="1B2430"/>
+          <w:sz w:val="21"/>
+          <w:szCs w:val="21"/>
+          <w:lang w:val="en"/>
+        </w:rPr>
+        <w:t>. Choose Minimize downtime (synchronize before failover) or Full download (faster, more downtime, use after a long time in Azure or if the on-premises VM was deleted).</w:t>
       </w:r>
     </w:p>
     <w:p>
@@ -2295,7 +2408,28 @@
           <w:szCs w:val="21"/>
           <w:lang w:val="en"/>
         </w:rPr>
-        <w:t>Log data is associated with the Azure VM while it runs there; search by computer name to see all of it.</w:t>
+        <w:t xml:space="preserve">After synchronization, complete the failover, check the VM, then </w:t>
+      </w:r>
+      <w:r>
+        <w:rPr>
+          <w:rStyle w:val="Strong"/>
+          <w:rFonts w:ascii="Segoe UI" w:eastAsia="Times New Roman" w:hAnsi="Segoe UI" w:cs="Segoe UI"/>
+          <w:color w:val="1B2430"/>
+          <w:sz w:val="21"/>
+          <w:szCs w:val="21"/>
+          <w:lang w:val="en"/>
+        </w:rPr>
+        <w:t>commit</w:t>
+      </w:r>
+      <w:r>
+        <w:rPr>
+          <w:rFonts w:ascii="Segoe UI" w:eastAsia="Times New Roman" w:hAnsi="Segoe UI" w:cs="Segoe UI"/>
+          <w:color w:val="1B2430"/>
+          <w:sz w:val="21"/>
+          <w:szCs w:val="21"/>
+          <w:lang w:val="en"/>
+        </w:rPr>
+        <w:t>.</w:t>
       </w:r>
     </w:p>
     <w:p>
@@ -2315,39 +2449,67 @@
       </w:pPr>
       <w:r>
         <w:rPr>
-          <w:rFonts w:ascii="Segoe UI" w:eastAsia="Times New Roman" w:hAnsi="Segoe UI" w:cs="Segoe UI"/>
-          <w:color w:val="1B2430"/>
-          <w:sz w:val="21"/>
-          <w:szCs w:val="21"/>
-          <w:lang w:val="en"/>
-        </w:rPr>
-        <w:t>Do not install the Azure VM Guest Agent on a machine that may return on-premises. If you must, disable extension management on it.</w:t>
-      </w:r>
-    </w:p>
-    <w:p>
-      <w:pPr>
-        <w:numPr>
-          <w:ilvl w:val="0"/>
-          <w:numId w:val="7"/>
-        </w:numPr>
-        <w:spacing w:after="100"/>
-        <w:rPr>
-          <w:rFonts w:ascii="Segoe UI" w:eastAsia="Times New Roman" w:hAnsi="Segoe UI" w:cs="Segoe UI"/>
-          <w:color w:val="1B2430"/>
-          <w:sz w:val="21"/>
-          <w:szCs w:val="21"/>
-          <w:lang w:val="en"/>
-        </w:rPr>
-      </w:pPr>
-      <w:r>
-        <w:rPr>
-          <w:rFonts w:ascii="Segoe UI" w:eastAsia="Times New Roman" w:hAnsi="Segoe UI" w:cs="Segoe UI"/>
-          <w:color w:val="1B2430"/>
-          <w:sz w:val="21"/>
-          <w:szCs w:val="21"/>
-          <w:lang w:val="en"/>
-        </w:rPr>
-        <w:t>If you delete an Azure Local VM after a failover, you must intervene manually to manage it again.</w:t>
+          <w:rStyle w:val="Strong"/>
+          <w:rFonts w:ascii="Segoe UI" w:eastAsia="Times New Roman" w:hAnsi="Segoe UI" w:cs="Segoe UI"/>
+          <w:color w:val="1B2430"/>
+          <w:sz w:val="21"/>
+          <w:szCs w:val="21"/>
+          <w:lang w:val="en"/>
+        </w:rPr>
+        <w:t>Reverse replicate</w:t>
+      </w:r>
+      <w:r>
+        <w:rPr>
+          <w:rFonts w:ascii="Segoe UI" w:eastAsia="Times New Roman" w:hAnsi="Segoe UI" w:cs="Segoe UI"/>
+          <w:color w:val="1B2430"/>
+          <w:sz w:val="21"/>
+          <w:szCs w:val="21"/>
+          <w:lang w:val="en"/>
+        </w:rPr>
+        <w:t xml:space="preserve"> so the VM again replicates to Azure.</w:t>
+      </w:r>
+    </w:p>
+    <w:p>
+      <w:pPr>
+        <w:pStyle w:val="NormalWeb"/>
+        <w:rPr>
+          <w:rFonts w:ascii="Segoe UI" w:hAnsi="Segoe UI" w:cs="Segoe UI"/>
+          <w:color w:val="1B2430"/>
+          <w:sz w:val="21"/>
+          <w:szCs w:val="21"/>
+          <w:lang w:val="en"/>
+        </w:rPr>
+      </w:pPr>
+      <w:r>
+        <w:rPr>
+          <w:rFonts w:ascii="Segoe UI" w:hAnsi="Segoe UI" w:cs="Segoe UI"/>
+          <w:color w:val="1B2430"/>
+          <w:sz w:val="21"/>
+          <w:szCs w:val="21"/>
+          <w:lang w:val="en"/>
+        </w:rPr>
+        <w:t xml:space="preserve">If the original cluster is unavailable, register another Azure Local cluster to the Site Recovery Hyper-V site and fail back there. The VM returns as an </w:t>
+      </w:r>
+      <w:r>
+        <w:rPr>
+          <w:rStyle w:val="Strong"/>
+          <w:rFonts w:ascii="Segoe UI" w:hAnsi="Segoe UI" w:cs="Segoe UI"/>
+          <w:color w:val="1B2430"/>
+          <w:sz w:val="21"/>
+          <w:szCs w:val="21"/>
+          <w:lang w:val="en"/>
+        </w:rPr>
+        <w:t>unmanaged VM</w:t>
+      </w:r>
+      <w:r>
+        <w:rPr>
+          <w:rFonts w:ascii="Segoe UI" w:hAnsi="Segoe UI" w:cs="Segoe UI"/>
+          <w:color w:val="1B2430"/>
+          <w:sz w:val="21"/>
+          <w:szCs w:val="21"/>
+          <w:lang w:val="en"/>
+        </w:rPr>
+        <w:t>: its services run, but it cannot be managed from Azure until it is registered on the new cluster and reconnected to its Azure resource (with the new resource group, custom location, storage path and logical network). Failing back to the same cluster restores the Azure connection within the Arc agent's 45-day reconnection window.</w:t>
       </w:r>
     </w:p>
     <w:p>
@@ -2363,7 +2525,7 @@
           <w:rFonts w:ascii="Segoe UI" w:eastAsia="Times New Roman" w:hAnsi="Segoe UI" w:cs="Segoe UI"/>
           <w:lang w:val="en"/>
         </w:rPr>
-        <w:t>Recovery plans</w:t>
+        <w:t>What we measured in the lab (13 Oct 2026)</w:t>
       </w:r>
     </w:p>
     <w:p>
@@ -2385,127 +2547,945 @@
           <w:szCs w:val="21"/>
           <w:lang w:val="en"/>
         </w:rPr>
-        <w:t>Group the VMs of an application into a recovery plan with boot order. Test the plan, not just single VMs, and rehearse it on the schedule your continuity requirements set.</w:t>
-      </w:r>
-    </w:p>
-    <w:p>
-      <w:pPr>
-        <w:pStyle w:val="Heading2"/>
-        <w:rPr>
-          <w:rFonts w:ascii="Segoe UI" w:eastAsia="Times New Roman" w:hAnsi="Segoe UI" w:cs="Segoe UI"/>
-          <w:lang w:val="en"/>
-        </w:rPr>
-      </w:pPr>
-      <w:r>
-        <w:rPr>
-          <w:rFonts w:ascii="Segoe UI" w:eastAsia="Times New Roman" w:hAnsi="Segoe UI" w:cs="Segoe UI"/>
-          <w:lang w:val="en"/>
-        </w:rPr>
-        <w:t>Checklist before you rely on it</w:t>
-      </w:r>
-    </w:p>
-    <w:p>
-      <w:pPr>
-        <w:pStyle w:val="task-list-item"/>
+        <w:t>Two-machine Azure Local instance, one Windows Server 2025 VM (Standard security type, 2 vCPU, 8 GB, 127 GB dynamic OS disk), replication to managed disks in the same region:</w:t>
+      </w:r>
+    </w:p>
+    <w:tbl>
+      <w:tblPr>
+        <w:tblW w:w="5000" w:type="pct"/>
+        <w:tblCellMar>
+          <w:top w:w="15" w:type="dxa"/>
+          <w:left w:w="15" w:type="dxa"/>
+          <w:bottom w:w="15" w:type="dxa"/>
+          <w:right w:w="15" w:type="dxa"/>
+        </w:tblCellMar>
+        <w:tblLook w:val="04A0" w:firstRow="1" w:lastRow="0" w:firstColumn="1" w:lastColumn="0" w:noHBand="0" w:noVBand="1"/>
+      </w:tblPr>
+      <w:tblGrid>
+        <w:gridCol w:w="4598"/>
+        <w:gridCol w:w="4746"/>
+      </w:tblGrid>
+      <w:tr>
+        <w:trPr>
+          <w:cantSplit/>
+          <w:tblHeader/>
+        </w:trPr>
+        <w:tc>
+          <w:tcPr>
+            <w:tcW w:w="0" w:type="auto"/>
+            <w:tcBorders>
+              <w:top w:val="single" w:sz="6" w:space="0" w:color="B8C4D0"/>
+              <w:left w:val="single" w:sz="6" w:space="0" w:color="B8C4D0"/>
+              <w:bottom w:val="single" w:sz="6" w:space="0" w:color="B8C4D0"/>
+              <w:right w:val="single" w:sz="6" w:space="0" w:color="B8C4D0"/>
+            </w:tcBorders>
+            <w:shd w:val="clear" w:color="auto" w:fill="E6EDF3"/>
+            <w:tcMar>
+              <w:top w:w="60" w:type="dxa"/>
+              <w:left w:w="100" w:type="dxa"/>
+              <w:bottom w:w="60" w:type="dxa"/>
+              <w:right w:w="100" w:type="dxa"/>
+            </w:tcMar>
+            <w:hideMark/>
+          </w:tcPr>
+          <w:p>
+            <w:pPr>
+              <w:spacing w:before="120" w:after="200"/>
+              <w:rPr>
+                <w:rFonts w:ascii="Segoe UI" w:eastAsia="Times New Roman" w:hAnsi="Segoe UI" w:cs="Segoe UI"/>
+                <w:b/>
+                <w:bCs/>
+                <w:color w:val="1B2430"/>
+                <w:sz w:val="18"/>
+                <w:szCs w:val="18"/>
+              </w:rPr>
+            </w:pPr>
+            <w:r>
+              <w:rPr>
+                <w:rFonts w:ascii="Segoe UI" w:eastAsia="Times New Roman" w:hAnsi="Segoe UI" w:cs="Segoe UI"/>
+                <w:b/>
+                <w:bCs/>
+                <w:color w:val="1B2430"/>
+                <w:sz w:val="18"/>
+                <w:szCs w:val="18"/>
+              </w:rPr>
+              <w:t>Step</w:t>
+            </w:r>
+          </w:p>
+        </w:tc>
+        <w:tc>
+          <w:tcPr>
+            <w:tcW w:w="0" w:type="auto"/>
+            <w:tcBorders>
+              <w:top w:val="single" w:sz="6" w:space="0" w:color="B8C4D0"/>
+              <w:left w:val="single" w:sz="6" w:space="0" w:color="B8C4D0"/>
+              <w:bottom w:val="single" w:sz="6" w:space="0" w:color="B8C4D0"/>
+              <w:right w:val="single" w:sz="6" w:space="0" w:color="B8C4D0"/>
+            </w:tcBorders>
+            <w:shd w:val="clear" w:color="auto" w:fill="E6EDF3"/>
+            <w:tcMar>
+              <w:top w:w="60" w:type="dxa"/>
+              <w:left w:w="100" w:type="dxa"/>
+              <w:bottom w:w="60" w:type="dxa"/>
+              <w:right w:w="100" w:type="dxa"/>
+            </w:tcMar>
+            <w:hideMark/>
+          </w:tcPr>
+          <w:p>
+            <w:pPr>
+              <w:spacing w:before="120" w:after="200"/>
+              <w:rPr>
+                <w:rFonts w:ascii="Segoe UI" w:eastAsia="Times New Roman" w:hAnsi="Segoe UI" w:cs="Segoe UI"/>
+                <w:b/>
+                <w:bCs/>
+                <w:color w:val="1B2430"/>
+                <w:sz w:val="18"/>
+                <w:szCs w:val="18"/>
+              </w:rPr>
+            </w:pPr>
+            <w:r>
+              <w:rPr>
+                <w:rFonts w:ascii="Segoe UI" w:eastAsia="Times New Roman" w:hAnsi="Segoe UI" w:cs="Segoe UI"/>
+                <w:b/>
+                <w:bCs/>
+                <w:color w:val="1B2430"/>
+                <w:sz w:val="18"/>
+                <w:szCs w:val="18"/>
+              </w:rPr>
+              <w:t>Time</w:t>
+            </w:r>
+          </w:p>
+        </w:tc>
+      </w:tr>
+      <w:tr>
+        <w:trPr>
+          <w:cantSplit/>
+        </w:trPr>
+        <w:tc>
+          <w:tcPr>
+            <w:tcW w:w="0" w:type="auto"/>
+            <w:tcBorders>
+              <w:top w:val="single" w:sz="6" w:space="0" w:color="B8C4D0"/>
+              <w:left w:val="single" w:sz="6" w:space="0" w:color="B8C4D0"/>
+              <w:bottom w:val="single" w:sz="6" w:space="0" w:color="B8C4D0"/>
+              <w:right w:val="single" w:sz="6" w:space="0" w:color="B8C4D0"/>
+            </w:tcBorders>
+            <w:tcMar>
+              <w:top w:w="60" w:type="dxa"/>
+              <w:left w:w="100" w:type="dxa"/>
+              <w:bottom w:w="60" w:type="dxa"/>
+              <w:right w:w="100" w:type="dxa"/>
+            </w:tcMar>
+            <w:hideMark/>
+          </w:tcPr>
+          <w:p>
+            <w:pPr>
+              <w:spacing w:before="120" w:after="200"/>
+              <w:rPr>
+                <w:rFonts w:ascii="Segoe UI" w:eastAsia="Times New Roman" w:hAnsi="Segoe UI" w:cs="Segoe UI"/>
+                <w:color w:val="1B2430"/>
+                <w:sz w:val="18"/>
+                <w:szCs w:val="18"/>
+              </w:rPr>
+            </w:pPr>
+            <w:r>
+              <w:rPr>
+                <w:rFonts w:ascii="Segoe UI" w:eastAsia="Times New Roman" w:hAnsi="Segoe UI" w:cs="Segoe UI"/>
+                <w:color w:val="1B2430"/>
+                <w:sz w:val="18"/>
+                <w:szCs w:val="18"/>
+              </w:rPr>
+              <w:t>Agent installed on both machines (cluster extension)</w:t>
+            </w:r>
+          </w:p>
+        </w:tc>
+        <w:tc>
+          <w:tcPr>
+            <w:tcW w:w="0" w:type="auto"/>
+            <w:tcBorders>
+              <w:top w:val="single" w:sz="6" w:space="0" w:color="B8C4D0"/>
+              <w:left w:val="single" w:sz="6" w:space="0" w:color="B8C4D0"/>
+              <w:bottom w:val="single" w:sz="6" w:space="0" w:color="B8C4D0"/>
+              <w:right w:val="single" w:sz="6" w:space="0" w:color="B8C4D0"/>
+            </w:tcBorders>
+            <w:tcMar>
+              <w:top w:w="60" w:type="dxa"/>
+              <w:left w:w="100" w:type="dxa"/>
+              <w:bottom w:w="60" w:type="dxa"/>
+              <w:right w:w="100" w:type="dxa"/>
+            </w:tcMar>
+            <w:hideMark/>
+          </w:tcPr>
+          <w:p>
+            <w:pPr>
+              <w:spacing w:before="120" w:after="200"/>
+              <w:rPr>
+                <w:rFonts w:ascii="Segoe UI" w:eastAsia="Times New Roman" w:hAnsi="Segoe UI" w:cs="Segoe UI"/>
+                <w:color w:val="1B2430"/>
+                <w:sz w:val="18"/>
+                <w:szCs w:val="18"/>
+              </w:rPr>
+            </w:pPr>
+            <w:r>
+              <w:rPr>
+                <w:rFonts w:ascii="Segoe UI" w:eastAsia="Times New Roman" w:hAnsi="Segoe UI" w:cs="Segoe UI"/>
+                <w:color w:val="1B2430"/>
+                <w:sz w:val="18"/>
+                <w:szCs w:val="18"/>
+              </w:rPr>
+              <w:t>about 11 min, plus about 3 min to associate the policy</w:t>
+            </w:r>
+          </w:p>
+        </w:tc>
+      </w:tr>
+      <w:tr>
+        <w:trPr>
+          <w:cantSplit/>
+        </w:trPr>
+        <w:tc>
+          <w:tcPr>
+            <w:tcW w:w="0" w:type="auto"/>
+            <w:tcBorders>
+              <w:top w:val="single" w:sz="6" w:space="0" w:color="B8C4D0"/>
+              <w:left w:val="single" w:sz="6" w:space="0" w:color="B8C4D0"/>
+              <w:bottom w:val="single" w:sz="6" w:space="0" w:color="B8C4D0"/>
+              <w:right w:val="single" w:sz="6" w:space="0" w:color="B8C4D0"/>
+            </w:tcBorders>
+            <w:tcMar>
+              <w:top w:w="60" w:type="dxa"/>
+              <w:left w:w="100" w:type="dxa"/>
+              <w:bottom w:w="60" w:type="dxa"/>
+              <w:right w:w="100" w:type="dxa"/>
+            </w:tcMar>
+            <w:hideMark/>
+          </w:tcPr>
+          <w:p>
+            <w:pPr>
+              <w:spacing w:before="120" w:after="200"/>
+              <w:rPr>
+                <w:rFonts w:ascii="Segoe UI" w:eastAsia="Times New Roman" w:hAnsi="Segoe UI" w:cs="Segoe UI"/>
+                <w:color w:val="1B2430"/>
+                <w:sz w:val="18"/>
+                <w:szCs w:val="18"/>
+              </w:rPr>
+            </w:pPr>
+            <w:r>
+              <w:rPr>
+                <w:rFonts w:ascii="Segoe UI" w:eastAsia="Times New Roman" w:hAnsi="Segoe UI" w:cs="Segoe UI"/>
+                <w:color w:val="1B2430"/>
+                <w:sz w:val="18"/>
+                <w:szCs w:val="18"/>
+              </w:rPr>
+              <w:t>Enable replication job</w:t>
+            </w:r>
+          </w:p>
+        </w:tc>
+        <w:tc>
+          <w:tcPr>
+            <w:tcW w:w="0" w:type="auto"/>
+            <w:tcBorders>
+              <w:top w:val="single" w:sz="6" w:space="0" w:color="B8C4D0"/>
+              <w:left w:val="single" w:sz="6" w:space="0" w:color="B8C4D0"/>
+              <w:bottom w:val="single" w:sz="6" w:space="0" w:color="B8C4D0"/>
+              <w:right w:val="single" w:sz="6" w:space="0" w:color="B8C4D0"/>
+            </w:tcBorders>
+            <w:tcMar>
+              <w:top w:w="60" w:type="dxa"/>
+              <w:left w:w="100" w:type="dxa"/>
+              <w:bottom w:w="60" w:type="dxa"/>
+              <w:right w:w="100" w:type="dxa"/>
+            </w:tcMar>
+            <w:hideMark/>
+          </w:tcPr>
+          <w:p>
+            <w:pPr>
+              <w:spacing w:before="120" w:after="200"/>
+              <w:rPr>
+                <w:rFonts w:ascii="Segoe UI" w:eastAsia="Times New Roman" w:hAnsi="Segoe UI" w:cs="Segoe UI"/>
+                <w:color w:val="1B2430"/>
+                <w:sz w:val="18"/>
+                <w:szCs w:val="18"/>
+              </w:rPr>
+            </w:pPr>
+            <w:r>
+              <w:rPr>
+                <w:rFonts w:ascii="Segoe UI" w:eastAsia="Times New Roman" w:hAnsi="Segoe UI" w:cs="Segoe UI"/>
+                <w:color w:val="1B2430"/>
+                <w:sz w:val="18"/>
+                <w:szCs w:val="18"/>
+              </w:rPr>
+              <w:t>77 s</w:t>
+            </w:r>
+          </w:p>
+        </w:tc>
+      </w:tr>
+      <w:tr>
+        <w:trPr>
+          <w:cantSplit/>
+        </w:trPr>
+        <w:tc>
+          <w:tcPr>
+            <w:tcW w:w="0" w:type="auto"/>
+            <w:tcBorders>
+              <w:top w:val="single" w:sz="6" w:space="0" w:color="B8C4D0"/>
+              <w:left w:val="single" w:sz="6" w:space="0" w:color="B8C4D0"/>
+              <w:bottom w:val="single" w:sz="6" w:space="0" w:color="B8C4D0"/>
+              <w:right w:val="single" w:sz="6" w:space="0" w:color="B8C4D0"/>
+            </w:tcBorders>
+            <w:tcMar>
+              <w:top w:w="60" w:type="dxa"/>
+              <w:left w:w="100" w:type="dxa"/>
+              <w:bottom w:w="60" w:type="dxa"/>
+              <w:right w:w="100" w:type="dxa"/>
+            </w:tcMar>
+            <w:hideMark/>
+          </w:tcPr>
+          <w:p>
+            <w:pPr>
+              <w:spacing w:before="120" w:after="200"/>
+              <w:rPr>
+                <w:rFonts w:ascii="Segoe UI" w:eastAsia="Times New Roman" w:hAnsi="Segoe UI" w:cs="Segoe UI"/>
+                <w:color w:val="1B2430"/>
+                <w:sz w:val="18"/>
+                <w:szCs w:val="18"/>
+              </w:rPr>
+            </w:pPr>
+            <w:r>
+              <w:rPr>
+                <w:rFonts w:ascii="Segoe UI" w:eastAsia="Times New Roman" w:hAnsi="Segoe UI" w:cs="Segoe UI"/>
+                <w:color w:val="1B2430"/>
+                <w:sz w:val="18"/>
+                <w:szCs w:val="18"/>
+              </w:rPr>
+              <w:t xml:space="preserve">Initial replication until </w:t>
+            </w:r>
+            <w:r>
+              <w:rPr>
+                <w:rStyle w:val="Emphasis"/>
+                <w:rFonts w:ascii="Segoe UI" w:eastAsia="Times New Roman" w:hAnsi="Segoe UI" w:cs="Segoe UI"/>
+                <w:color w:val="1B2430"/>
+                <w:sz w:val="18"/>
+                <w:szCs w:val="18"/>
+              </w:rPr>
+              <w:t>Protected</w:t>
+            </w:r>
+          </w:p>
+        </w:tc>
+        <w:tc>
+          <w:tcPr>
+            <w:tcW w:w="0" w:type="auto"/>
+            <w:tcBorders>
+              <w:top w:val="single" w:sz="6" w:space="0" w:color="B8C4D0"/>
+              <w:left w:val="single" w:sz="6" w:space="0" w:color="B8C4D0"/>
+              <w:bottom w:val="single" w:sz="6" w:space="0" w:color="B8C4D0"/>
+              <w:right w:val="single" w:sz="6" w:space="0" w:color="B8C4D0"/>
+            </w:tcBorders>
+            <w:tcMar>
+              <w:top w:w="60" w:type="dxa"/>
+              <w:left w:w="100" w:type="dxa"/>
+              <w:bottom w:w="60" w:type="dxa"/>
+              <w:right w:w="100" w:type="dxa"/>
+            </w:tcMar>
+            <w:hideMark/>
+          </w:tcPr>
+          <w:p>
+            <w:pPr>
+              <w:spacing w:before="120" w:after="200"/>
+              <w:rPr>
+                <w:rFonts w:ascii="Segoe UI" w:eastAsia="Times New Roman" w:hAnsi="Segoe UI" w:cs="Segoe UI"/>
+                <w:color w:val="1B2430"/>
+                <w:sz w:val="18"/>
+                <w:szCs w:val="18"/>
+              </w:rPr>
+            </w:pPr>
+            <w:r>
+              <w:rPr>
+                <w:rFonts w:ascii="Segoe UI" w:eastAsia="Times New Roman" w:hAnsi="Segoe UI" w:cs="Segoe UI"/>
+                <w:color w:val="1B2430"/>
+                <w:sz w:val="18"/>
+                <w:szCs w:val="18"/>
+              </w:rPr>
+              <w:t>about 25 min</w:t>
+            </w:r>
+          </w:p>
+        </w:tc>
+      </w:tr>
+      <w:tr>
+        <w:trPr>
+          <w:cantSplit/>
+        </w:trPr>
+        <w:tc>
+          <w:tcPr>
+            <w:tcW w:w="0" w:type="auto"/>
+            <w:tcBorders>
+              <w:top w:val="single" w:sz="6" w:space="0" w:color="B8C4D0"/>
+              <w:left w:val="single" w:sz="6" w:space="0" w:color="B8C4D0"/>
+              <w:bottom w:val="single" w:sz="6" w:space="0" w:color="B8C4D0"/>
+              <w:right w:val="single" w:sz="6" w:space="0" w:color="B8C4D0"/>
+            </w:tcBorders>
+            <w:tcMar>
+              <w:top w:w="60" w:type="dxa"/>
+              <w:left w:w="100" w:type="dxa"/>
+              <w:bottom w:w="60" w:type="dxa"/>
+              <w:right w:w="100" w:type="dxa"/>
+            </w:tcMar>
+            <w:hideMark/>
+          </w:tcPr>
+          <w:p>
+            <w:pPr>
+              <w:spacing w:before="120" w:after="200"/>
+              <w:rPr>
+                <w:rFonts w:ascii="Segoe UI" w:eastAsia="Times New Roman" w:hAnsi="Segoe UI" w:cs="Segoe UI"/>
+                <w:color w:val="1B2430"/>
+                <w:sz w:val="18"/>
+                <w:szCs w:val="18"/>
+              </w:rPr>
+            </w:pPr>
+            <w:r>
+              <w:rPr>
+                <w:rFonts w:ascii="Segoe UI" w:eastAsia="Times New Roman" w:hAnsi="Segoe UI" w:cs="Segoe UI"/>
+                <w:color w:val="1B2430"/>
+                <w:sz w:val="18"/>
+                <w:szCs w:val="18"/>
+              </w:rPr>
+              <w:t>Test failover job (latest processed point)</w:t>
+            </w:r>
+          </w:p>
+        </w:tc>
+        <w:tc>
+          <w:tcPr>
+            <w:tcW w:w="0" w:type="auto"/>
+            <w:tcBorders>
+              <w:top w:val="single" w:sz="6" w:space="0" w:color="B8C4D0"/>
+              <w:left w:val="single" w:sz="6" w:space="0" w:color="B8C4D0"/>
+              <w:bottom w:val="single" w:sz="6" w:space="0" w:color="B8C4D0"/>
+              <w:right w:val="single" w:sz="6" w:space="0" w:color="B8C4D0"/>
+            </w:tcBorders>
+            <w:tcMar>
+              <w:top w:w="60" w:type="dxa"/>
+              <w:left w:w="100" w:type="dxa"/>
+              <w:bottom w:w="60" w:type="dxa"/>
+              <w:right w:w="100" w:type="dxa"/>
+            </w:tcMar>
+            <w:hideMark/>
+          </w:tcPr>
+          <w:p>
+            <w:pPr>
+              <w:spacing w:before="120" w:after="200"/>
+              <w:rPr>
+                <w:rFonts w:ascii="Segoe UI" w:eastAsia="Times New Roman" w:hAnsi="Segoe UI" w:cs="Segoe UI"/>
+                <w:color w:val="1B2430"/>
+                <w:sz w:val="18"/>
+                <w:szCs w:val="18"/>
+              </w:rPr>
+            </w:pPr>
+            <w:r>
+              <w:rPr>
+                <w:rFonts w:ascii="Segoe UI" w:eastAsia="Times New Roman" w:hAnsi="Segoe UI" w:cs="Segoe UI"/>
+                <w:color w:val="1B2430"/>
+                <w:sz w:val="18"/>
+                <w:szCs w:val="18"/>
+              </w:rPr>
+              <w:t>13 min 25 s</w:t>
+            </w:r>
+          </w:p>
+        </w:tc>
+      </w:tr>
+      <w:tr>
+        <w:trPr>
+          <w:cantSplit/>
+        </w:trPr>
+        <w:tc>
+          <w:tcPr>
+            <w:tcW w:w="0" w:type="auto"/>
+            <w:tcBorders>
+              <w:top w:val="single" w:sz="6" w:space="0" w:color="B8C4D0"/>
+              <w:left w:val="single" w:sz="6" w:space="0" w:color="B8C4D0"/>
+              <w:bottom w:val="single" w:sz="6" w:space="0" w:color="B8C4D0"/>
+              <w:right w:val="single" w:sz="6" w:space="0" w:color="B8C4D0"/>
+            </w:tcBorders>
+            <w:tcMar>
+              <w:top w:w="60" w:type="dxa"/>
+              <w:left w:w="100" w:type="dxa"/>
+              <w:bottom w:w="60" w:type="dxa"/>
+              <w:right w:w="100" w:type="dxa"/>
+            </w:tcMar>
+            <w:hideMark/>
+          </w:tcPr>
+          <w:p>
+            <w:pPr>
+              <w:spacing w:before="120" w:after="200"/>
+              <w:rPr>
+                <w:rFonts w:ascii="Segoe UI" w:eastAsia="Times New Roman" w:hAnsi="Segoe UI" w:cs="Segoe UI"/>
+                <w:color w:val="1B2430"/>
+                <w:sz w:val="18"/>
+                <w:szCs w:val="18"/>
+              </w:rPr>
+            </w:pPr>
+            <w:r>
+              <w:rPr>
+                <w:rFonts w:ascii="Segoe UI" w:eastAsia="Times New Roman" w:hAnsi="Segoe UI" w:cs="Segoe UI"/>
+                <w:color w:val="1B2430"/>
+                <w:sz w:val="18"/>
+                <w:szCs w:val="18"/>
+              </w:rPr>
+              <w:t>Test failover cleanup</w:t>
+            </w:r>
+          </w:p>
+        </w:tc>
+        <w:tc>
+          <w:tcPr>
+            <w:tcW w:w="0" w:type="auto"/>
+            <w:tcBorders>
+              <w:top w:val="single" w:sz="6" w:space="0" w:color="B8C4D0"/>
+              <w:left w:val="single" w:sz="6" w:space="0" w:color="B8C4D0"/>
+              <w:bottom w:val="single" w:sz="6" w:space="0" w:color="B8C4D0"/>
+              <w:right w:val="single" w:sz="6" w:space="0" w:color="B8C4D0"/>
+            </w:tcBorders>
+            <w:tcMar>
+              <w:top w:w="60" w:type="dxa"/>
+              <w:left w:w="100" w:type="dxa"/>
+              <w:bottom w:w="60" w:type="dxa"/>
+              <w:right w:w="100" w:type="dxa"/>
+            </w:tcMar>
+            <w:hideMark/>
+          </w:tcPr>
+          <w:p>
+            <w:pPr>
+              <w:spacing w:before="120" w:after="200"/>
+              <w:rPr>
+                <w:rFonts w:ascii="Segoe UI" w:eastAsia="Times New Roman" w:hAnsi="Segoe UI" w:cs="Segoe UI"/>
+                <w:color w:val="1B2430"/>
+                <w:sz w:val="18"/>
+                <w:szCs w:val="18"/>
+              </w:rPr>
+            </w:pPr>
+            <w:r>
+              <w:rPr>
+                <w:rFonts w:ascii="Segoe UI" w:eastAsia="Times New Roman" w:hAnsi="Segoe UI" w:cs="Segoe UI"/>
+                <w:color w:val="1B2430"/>
+                <w:sz w:val="18"/>
+                <w:szCs w:val="18"/>
+              </w:rPr>
+              <w:t>70 s</w:t>
+            </w:r>
+          </w:p>
+        </w:tc>
+      </w:tr>
+    </w:tbl>
+    <w:p>
+      <w:pPr>
+        <w:pStyle w:val="NormalWeb"/>
+        <w:rPr>
+          <w:rFonts w:ascii="Segoe UI" w:hAnsi="Segoe UI" w:cs="Segoe UI"/>
+          <w:color w:val="1B2430"/>
+          <w:sz w:val="21"/>
+          <w:szCs w:val="21"/>
+          <w:lang w:val="en"/>
+        </w:rPr>
+      </w:pPr>
+      <w:r>
+        <w:rPr>
+          <w:rFonts w:ascii="Segoe UI" w:hAnsi="Segoe UI" w:cs="Segoe UI"/>
+          <w:color w:val="1B2430"/>
+          <w:sz w:val="21"/>
+          <w:szCs w:val="21"/>
+          <w:lang w:val="en"/>
+        </w:rPr>
+        <w:t>Things that cost us time, so they do not cost you:</w:t>
+      </w:r>
+    </w:p>
+    <w:p>
+      <w:pPr>
         <w:numPr>
           <w:ilvl w:val="0"/>
           <w:numId w:val="8"/>
         </w:numPr>
-        <w:rPr>
-          <w:rFonts w:ascii="Segoe UI" w:eastAsia="Times New Roman" w:hAnsi="Segoe UI" w:cs="Segoe UI"/>
-          <w:color w:val="1B2430"/>
-          <w:sz w:val="21"/>
-          <w:szCs w:val="21"/>
-          <w:lang w:val="en"/>
-        </w:rPr>
-      </w:pPr>
-      <w:r>
-        <w:rPr>
-          <w:rFonts w:ascii="Segoe UI" w:eastAsia="Times New Roman" w:hAnsi="Segoe UI" w:cs="Segoe UI"/>
-          <w:color w:val="1B2430"/>
-          <w:sz w:val="21"/>
-          <w:szCs w:val="21"/>
-          <w:lang w:val="en"/>
-        </w:rPr>
-        <w:t>Replication health is healthy and the recovery point is recent</w:t>
-      </w:r>
-    </w:p>
-    <w:p>
-      <w:pPr>
-        <w:pStyle w:val="task-list-item"/>
+        <w:spacing w:after="100"/>
+        <w:rPr>
+          <w:rFonts w:ascii="Segoe UI" w:eastAsia="Times New Roman" w:hAnsi="Segoe UI" w:cs="Segoe UI"/>
+          <w:color w:val="1B2430"/>
+          <w:sz w:val="21"/>
+          <w:szCs w:val="21"/>
+          <w:lang w:val="en"/>
+        </w:rPr>
+      </w:pPr>
+      <w:r>
+        <w:rPr>
+          <w:rFonts w:ascii="Segoe UI" w:eastAsia="Times New Roman" w:hAnsi="Segoe UI" w:cs="Segoe UI"/>
+          <w:color w:val="1B2430"/>
+          <w:sz w:val="21"/>
+          <w:szCs w:val="21"/>
+          <w:lang w:val="en"/>
+        </w:rPr>
+        <w:t xml:space="preserve">Create the VM as a </w:t>
+      </w:r>
+      <w:r>
+        <w:rPr>
+          <w:rStyle w:val="Strong"/>
+          <w:rFonts w:ascii="Segoe UI" w:eastAsia="Times New Roman" w:hAnsi="Segoe UI" w:cs="Segoe UI"/>
+          <w:color w:val="1B2430"/>
+          <w:sz w:val="21"/>
+          <w:szCs w:val="21"/>
+          <w:lang w:val="en"/>
+        </w:rPr>
+        <w:t>Standard</w:t>
+      </w:r>
+      <w:r>
+        <w:rPr>
+          <w:rFonts w:ascii="Segoe UI" w:eastAsia="Times New Roman" w:hAnsi="Segoe UI" w:cs="Segoe UI"/>
+          <w:color w:val="1B2430"/>
+          <w:sz w:val="21"/>
+          <w:szCs w:val="21"/>
+          <w:lang w:val="en"/>
+        </w:rPr>
+        <w:t xml:space="preserve"> security type (no Trusted launch, secure boot off) before you plan Site Recovery for it.</w:t>
+      </w:r>
+    </w:p>
+    <w:p>
+      <w:pPr>
         <w:numPr>
           <w:ilvl w:val="0"/>
           <w:numId w:val="8"/>
         </w:numPr>
-        <w:rPr>
-          <w:rFonts w:ascii="Segoe UI" w:eastAsia="Times New Roman" w:hAnsi="Segoe UI" w:cs="Segoe UI"/>
-          <w:color w:val="1B2430"/>
-          <w:sz w:val="21"/>
-          <w:szCs w:val="21"/>
-          <w:lang w:val="en"/>
-        </w:rPr>
-      </w:pPr>
-      <w:r>
-        <w:rPr>
-          <w:rFonts w:ascii="Segoe UI" w:eastAsia="Times New Roman" w:hAnsi="Segoe UI" w:cs="Segoe UI"/>
-          <w:color w:val="1B2430"/>
-          <w:sz w:val="21"/>
-          <w:szCs w:val="21"/>
-          <w:lang w:val="en"/>
-        </w:rPr>
-        <w:t>A test failover completed in the last quarter, with application validation</w:t>
-      </w:r>
-    </w:p>
-    <w:p>
-      <w:pPr>
-        <w:pStyle w:val="task-list-item"/>
+        <w:spacing w:after="100"/>
+        <w:rPr>
+          <w:rFonts w:ascii="Segoe UI" w:eastAsia="Times New Roman" w:hAnsi="Segoe UI" w:cs="Segoe UI"/>
+          <w:color w:val="1B2430"/>
+          <w:sz w:val="21"/>
+          <w:szCs w:val="21"/>
+          <w:lang w:val="en"/>
+        </w:rPr>
+      </w:pPr>
+      <w:r>
+        <w:rPr>
+          <w:rFonts w:ascii="Segoe UI" w:eastAsia="Times New Roman" w:hAnsi="Segoe UI" w:cs="Segoe UI"/>
+          <w:color w:val="1B2430"/>
+          <w:sz w:val="21"/>
+          <w:szCs w:val="21"/>
+          <w:lang w:val="en"/>
+        </w:rPr>
+        <w:t>Without a connected guest agent the protectable item reports no operating system: choose the OS type and the OS disk yourself.</w:t>
+      </w:r>
+    </w:p>
+    <w:p>
+      <w:pPr>
         <w:numPr>
           <w:ilvl w:val="0"/>
           <w:numId w:val="8"/>
         </w:numPr>
-        <w:rPr>
-          <w:rFonts w:ascii="Segoe UI" w:eastAsia="Times New Roman" w:hAnsi="Segoe UI" w:cs="Segoe UI"/>
-          <w:color w:val="1B2430"/>
-          <w:sz w:val="21"/>
-          <w:szCs w:val="21"/>
-          <w:lang w:val="en"/>
-        </w:rPr>
-      </w:pPr>
-      <w:r>
-        <w:rPr>
-          <w:rFonts w:ascii="Segoe UI" w:eastAsia="Times New Roman" w:hAnsi="Segoe UI" w:cs="Segoe UI"/>
-          <w:color w:val="1B2430"/>
-          <w:sz w:val="21"/>
-          <w:szCs w:val="21"/>
-          <w:lang w:val="en"/>
-        </w:rPr>
-        <w:t>The Azure target network, DNS and access are ready</w:t>
-      </w:r>
-    </w:p>
-    <w:p>
-      <w:pPr>
-        <w:pStyle w:val="task-list-item"/>
+        <w:spacing w:after="100"/>
+        <w:rPr>
+          <w:rFonts w:ascii="Segoe UI" w:eastAsia="Times New Roman" w:hAnsi="Segoe UI" w:cs="Segoe UI"/>
+          <w:color w:val="1B2430"/>
+          <w:sz w:val="21"/>
+          <w:szCs w:val="21"/>
+          <w:lang w:val="en"/>
+        </w:rPr>
+      </w:pPr>
+      <w:r>
+        <w:rPr>
+          <w:rFonts w:ascii="Segoe UI" w:eastAsia="Times New Roman" w:hAnsi="Segoe UI" w:cs="Segoe UI"/>
+          <w:color w:val="1B2430"/>
+          <w:sz w:val="21"/>
+          <w:szCs w:val="21"/>
+          <w:lang w:val="en"/>
+        </w:rPr>
+        <w:t>Pick a failover size that your subscription offers in the region and that has a SCSI disk controller and supports the VM's generation; several current sizes are NVMe-only.</w:t>
+      </w:r>
+    </w:p>
+    <w:p>
+      <w:pPr>
         <w:numPr>
           <w:ilvl w:val="0"/>
           <w:numId w:val="8"/>
         </w:numPr>
-        <w:rPr>
-          <w:rFonts w:ascii="Segoe UI" w:eastAsia="Times New Roman" w:hAnsi="Segoe UI" w:cs="Segoe UI"/>
-          <w:color w:val="1B2430"/>
-          <w:sz w:val="21"/>
-          <w:szCs w:val="21"/>
-          <w:lang w:val="en"/>
-        </w:rPr>
-      </w:pPr>
-      <w:r>
-        <w:rPr>
-          <w:rFonts w:ascii="Segoe UI" w:eastAsia="Times New Roman" w:hAnsi="Segoe UI" w:cs="Segoe UI"/>
-          <w:color w:val="1B2430"/>
-          <w:sz w:val="21"/>
-          <w:szCs w:val="21"/>
-          <w:lang w:val="en"/>
-        </w:rPr>
-        <w:t>The failback path is documented, including the unmanaged-VM case</w:t>
+        <w:spacing w:after="100"/>
+        <w:rPr>
+          <w:rFonts w:ascii="Segoe UI" w:eastAsia="Times New Roman" w:hAnsi="Segoe UI" w:cs="Segoe UI"/>
+          <w:color w:val="1B2430"/>
+          <w:sz w:val="21"/>
+          <w:szCs w:val="21"/>
+          <w:lang w:val="en"/>
+        </w:rPr>
+      </w:pPr>
+      <w:r>
+        <w:rPr>
+          <w:rFonts w:ascii="Segoe UI" w:eastAsia="Times New Roman" w:hAnsi="Segoe UI" w:cs="Segoe UI"/>
+          <w:color w:val="1B2430"/>
+          <w:sz w:val="21"/>
+          <w:szCs w:val="21"/>
+          <w:lang w:val="en"/>
+        </w:rPr>
+        <w:t xml:space="preserve">The test VM takes the subnet of the test network that has the </w:t>
+      </w:r>
+      <w:r>
+        <w:rPr>
+          <w:rStyle w:val="Strong"/>
+          <w:rFonts w:ascii="Segoe UI" w:eastAsia="Times New Roman" w:hAnsi="Segoe UI" w:cs="Segoe UI"/>
+          <w:color w:val="1B2430"/>
+          <w:sz w:val="21"/>
+          <w:szCs w:val="21"/>
+          <w:lang w:val="en"/>
+        </w:rPr>
+        <w:t>recovery subnet's name</w:t>
+      </w:r>
+      <w:r>
+        <w:rPr>
+          <w:rFonts w:ascii="Segoe UI" w:eastAsia="Times New Roman" w:hAnsi="Segoe UI" w:cs="Segoe UI"/>
+          <w:color w:val="1B2430"/>
+          <w:sz w:val="21"/>
+          <w:szCs w:val="21"/>
+          <w:lang w:val="en"/>
+        </w:rPr>
+        <w:t>. If your test network is a separate, NSG-isolated subnet in the recovery virtual network, point the recovery subnet at it for the drill and back afterwards, or use a separate test network with the same subnet names.</w:t>
+      </w:r>
+    </w:p>
+    <w:p>
+      <w:pPr>
+        <w:numPr>
+          <w:ilvl w:val="0"/>
+          <w:numId w:val="8"/>
+        </w:numPr>
+        <w:spacing w:after="100"/>
+        <w:rPr>
+          <w:rFonts w:ascii="Segoe UI" w:eastAsia="Times New Roman" w:hAnsi="Segoe UI" w:cs="Segoe UI"/>
+          <w:color w:val="1B2430"/>
+          <w:sz w:val="21"/>
+          <w:szCs w:val="21"/>
+          <w:lang w:val="en"/>
+        </w:rPr>
+      </w:pPr>
+      <w:r>
+        <w:rPr>
+          <w:rFonts w:ascii="Segoe UI" w:eastAsia="Times New Roman" w:hAnsi="Segoe UI" w:cs="Segoe UI"/>
+          <w:color w:val="1B2430"/>
+          <w:sz w:val="21"/>
+          <w:szCs w:val="21"/>
+          <w:lang w:val="en"/>
+        </w:rPr>
+        <w:t xml:space="preserve">Compute and network settings are accepted only once the item is </w:t>
+      </w:r>
+      <w:r>
+        <w:rPr>
+          <w:rStyle w:val="Emphasis"/>
+          <w:rFonts w:ascii="Segoe UI" w:eastAsia="Times New Roman" w:hAnsi="Segoe UI" w:cs="Segoe UI"/>
+          <w:color w:val="1B2430"/>
+          <w:sz w:val="21"/>
+          <w:szCs w:val="21"/>
+          <w:lang w:val="en"/>
+        </w:rPr>
+        <w:t>Protected</w:t>
+      </w:r>
+      <w:r>
+        <w:rPr>
+          <w:rFonts w:ascii="Segoe UI" w:eastAsia="Times New Roman" w:hAnsi="Segoe UI" w:cs="Segoe UI"/>
+          <w:color w:val="1B2430"/>
+          <w:sz w:val="21"/>
+          <w:szCs w:val="21"/>
+          <w:lang w:val="en"/>
+        </w:rPr>
+        <w:t>.</w:t>
+      </w:r>
+    </w:p>
+    <w:p>
+      <w:pPr>
+        <w:pStyle w:val="Heading2"/>
+        <w:rPr>
+          <w:rFonts w:ascii="Segoe UI" w:eastAsia="Times New Roman" w:hAnsi="Segoe UI" w:cs="Segoe UI"/>
+          <w:lang w:val="en"/>
+        </w:rPr>
+      </w:pPr>
+      <w:r>
+        <w:rPr>
+          <w:rFonts w:ascii="Segoe UI" w:eastAsia="Times New Roman" w:hAnsi="Segoe UI" w:cs="Segoe UI"/>
+          <w:lang w:val="en"/>
+        </w:rPr>
+        <w:t>Caveats to put in the design record</w:t>
+      </w:r>
+    </w:p>
+    <w:p>
+      <w:pPr>
+        <w:numPr>
+          <w:ilvl w:val="0"/>
+          <w:numId w:val="9"/>
+        </w:numPr>
+        <w:spacing w:after="100"/>
+        <w:rPr>
+          <w:rFonts w:ascii="Segoe UI" w:eastAsia="Times New Roman" w:hAnsi="Segoe UI" w:cs="Segoe UI"/>
+          <w:color w:val="1B2430"/>
+          <w:sz w:val="21"/>
+          <w:szCs w:val="21"/>
+          <w:lang w:val="en"/>
+        </w:rPr>
+      </w:pPr>
+      <w:r>
+        <w:rPr>
+          <w:rFonts w:ascii="Segoe UI" w:eastAsia="Times New Roman" w:hAnsi="Segoe UI" w:cs="Segoe UI"/>
+          <w:color w:val="1B2430"/>
+          <w:sz w:val="21"/>
+          <w:szCs w:val="21"/>
+          <w:lang w:val="en"/>
+        </w:rPr>
+        <w:t>Arc extensions are not visible or manageable on the Azure VM while it runs in Azure.</w:t>
+      </w:r>
+    </w:p>
+    <w:p>
+      <w:pPr>
+        <w:numPr>
+          <w:ilvl w:val="0"/>
+          <w:numId w:val="9"/>
+        </w:numPr>
+        <w:spacing w:after="100"/>
+        <w:rPr>
+          <w:rFonts w:ascii="Segoe UI" w:eastAsia="Times New Roman" w:hAnsi="Segoe UI" w:cs="Segoe UI"/>
+          <w:color w:val="1B2430"/>
+          <w:sz w:val="21"/>
+          <w:szCs w:val="21"/>
+          <w:lang w:val="en"/>
+        </w:rPr>
+      </w:pPr>
+      <w:r>
+        <w:rPr>
+          <w:rFonts w:ascii="Segoe UI" w:eastAsia="Times New Roman" w:hAnsi="Segoe UI" w:cs="Segoe UI"/>
+          <w:color w:val="1B2430"/>
+          <w:sz w:val="21"/>
+          <w:szCs w:val="21"/>
+          <w:lang w:val="en"/>
+        </w:rPr>
+        <w:t>Guest Configuration policies do not run while the machine is in Azure.</w:t>
+      </w:r>
+    </w:p>
+    <w:p>
+      <w:pPr>
+        <w:numPr>
+          <w:ilvl w:val="0"/>
+          <w:numId w:val="9"/>
+        </w:numPr>
+        <w:spacing w:after="100"/>
+        <w:rPr>
+          <w:rFonts w:ascii="Segoe UI" w:eastAsia="Times New Roman" w:hAnsi="Segoe UI" w:cs="Segoe UI"/>
+          <w:color w:val="1B2430"/>
+          <w:sz w:val="21"/>
+          <w:szCs w:val="21"/>
+          <w:lang w:val="en"/>
+        </w:rPr>
+      </w:pPr>
+      <w:r>
+        <w:rPr>
+          <w:rFonts w:ascii="Segoe UI" w:eastAsia="Times New Roman" w:hAnsi="Segoe UI" w:cs="Segoe UI"/>
+          <w:color w:val="1B2430"/>
+          <w:sz w:val="21"/>
+          <w:szCs w:val="21"/>
+          <w:lang w:val="en"/>
+        </w:rPr>
+        <w:t>Log data is associated with the Azure VM while it runs there; search by computer name to see all of it.</w:t>
+      </w:r>
+    </w:p>
+    <w:p>
+      <w:pPr>
+        <w:numPr>
+          <w:ilvl w:val="0"/>
+          <w:numId w:val="9"/>
+        </w:numPr>
+        <w:spacing w:after="100"/>
+        <w:rPr>
+          <w:rFonts w:ascii="Segoe UI" w:eastAsia="Times New Roman" w:hAnsi="Segoe UI" w:cs="Segoe UI"/>
+          <w:color w:val="1B2430"/>
+          <w:sz w:val="21"/>
+          <w:szCs w:val="21"/>
+          <w:lang w:val="en"/>
+        </w:rPr>
+      </w:pPr>
+      <w:r>
+        <w:rPr>
+          <w:rFonts w:ascii="Segoe UI" w:eastAsia="Times New Roman" w:hAnsi="Segoe UI" w:cs="Segoe UI"/>
+          <w:color w:val="1B2430"/>
+          <w:sz w:val="21"/>
+          <w:szCs w:val="21"/>
+          <w:lang w:val="en"/>
+        </w:rPr>
+        <w:t>Do not install the Azure VM Guest Agent on a machine that may return on-premises. If you must, disable extension management on it.</w:t>
+      </w:r>
+    </w:p>
+    <w:p>
+      <w:pPr>
+        <w:numPr>
+          <w:ilvl w:val="0"/>
+          <w:numId w:val="9"/>
+        </w:numPr>
+        <w:spacing w:after="100"/>
+        <w:rPr>
+          <w:rFonts w:ascii="Segoe UI" w:eastAsia="Times New Roman" w:hAnsi="Segoe UI" w:cs="Segoe UI"/>
+          <w:color w:val="1B2430"/>
+          <w:sz w:val="21"/>
+          <w:szCs w:val="21"/>
+          <w:lang w:val="en"/>
+        </w:rPr>
+      </w:pPr>
+      <w:r>
+        <w:rPr>
+          <w:rFonts w:ascii="Segoe UI" w:eastAsia="Times New Roman" w:hAnsi="Segoe UI" w:cs="Segoe UI"/>
+          <w:color w:val="1B2430"/>
+          <w:sz w:val="21"/>
+          <w:szCs w:val="21"/>
+          <w:lang w:val="en"/>
+        </w:rPr>
+        <w:t>If you delete an Azure Local VM after a failover, you must intervene manually to manage it again.</w:t>
+      </w:r>
+    </w:p>
+    <w:p>
+      <w:pPr>
+        <w:pStyle w:val="Heading2"/>
+        <w:rPr>
+          <w:rFonts w:ascii="Segoe UI" w:eastAsia="Times New Roman" w:hAnsi="Segoe UI" w:cs="Segoe UI"/>
+          <w:lang w:val="en"/>
+        </w:rPr>
+      </w:pPr>
+      <w:r>
+        <w:rPr>
+          <w:rFonts w:ascii="Segoe UI" w:eastAsia="Times New Roman" w:hAnsi="Segoe UI" w:cs="Segoe UI"/>
+          <w:lang w:val="en"/>
+        </w:rPr>
+        <w:t>Recovery plans</w:t>
+      </w:r>
+    </w:p>
+    <w:p>
+      <w:pPr>
+        <w:pStyle w:val="NormalWeb"/>
+        <w:rPr>
+          <w:rFonts w:ascii="Segoe UI" w:hAnsi="Segoe UI" w:cs="Segoe UI"/>
+          <w:color w:val="1B2430"/>
+          <w:sz w:val="21"/>
+          <w:szCs w:val="21"/>
+          <w:lang w:val="en"/>
+        </w:rPr>
+      </w:pPr>
+      <w:r>
+        <w:rPr>
+          <w:rFonts w:ascii="Segoe UI" w:hAnsi="Segoe UI" w:cs="Segoe UI"/>
+          <w:color w:val="1B2430"/>
+          <w:sz w:val="21"/>
+          <w:szCs w:val="21"/>
+          <w:lang w:val="en"/>
+        </w:rPr>
+        <w:t>Group the VMs of an application into a recovery plan with boot order. Test the plan, not just single VMs, and rehearse it on the schedule your continuity requirements set.</w:t>
+      </w:r>
+    </w:p>
+    <w:p>
+      <w:pPr>
+        <w:pStyle w:val="Heading2"/>
+        <w:rPr>
+          <w:rFonts w:ascii="Segoe UI" w:eastAsia="Times New Roman" w:hAnsi="Segoe UI" w:cs="Segoe UI"/>
+          <w:lang w:val="en"/>
+        </w:rPr>
+      </w:pPr>
+      <w:r>
+        <w:rPr>
+          <w:rFonts w:ascii="Segoe UI" w:eastAsia="Times New Roman" w:hAnsi="Segoe UI" w:cs="Segoe UI"/>
+          <w:lang w:val="en"/>
+        </w:rPr>
+        <w:t>Checklist before you rely on it</w:t>
       </w:r>
     </w:p>
     <w:p>
@@ -2513,7 +3493,111 @@
         <w:pStyle w:val="task-list-item"/>
         <w:numPr>
           <w:ilvl w:val="0"/>
-          <w:numId w:val="8"/>
+          <w:numId w:val="10"/>
+        </w:numPr>
+        <w:rPr>
+          <w:rFonts w:ascii="Segoe UI" w:eastAsia="Times New Roman" w:hAnsi="Segoe UI" w:cs="Segoe UI"/>
+          <w:color w:val="1B2430"/>
+          <w:sz w:val="21"/>
+          <w:szCs w:val="21"/>
+          <w:lang w:val="en"/>
+        </w:rPr>
+      </w:pPr>
+      <w:r>
+        <w:rPr>
+          <w:rFonts w:ascii="Segoe UI" w:eastAsia="Times New Roman" w:hAnsi="Segoe UI" w:cs="Segoe UI"/>
+          <w:color w:val="1B2430"/>
+          <w:sz w:val="21"/>
+          <w:szCs w:val="21"/>
+          <w:lang w:val="en"/>
+        </w:rPr>
+        <w:t>Replication health is healthy and the recovery point is recent</w:t>
+      </w:r>
+    </w:p>
+    <w:p>
+      <w:pPr>
+        <w:pStyle w:val="task-list-item"/>
+        <w:numPr>
+          <w:ilvl w:val="0"/>
+          <w:numId w:val="10"/>
+        </w:numPr>
+        <w:rPr>
+          <w:rFonts w:ascii="Segoe UI" w:eastAsia="Times New Roman" w:hAnsi="Segoe UI" w:cs="Segoe UI"/>
+          <w:color w:val="1B2430"/>
+          <w:sz w:val="21"/>
+          <w:szCs w:val="21"/>
+          <w:lang w:val="en"/>
+        </w:rPr>
+      </w:pPr>
+      <w:r>
+        <w:rPr>
+          <w:rFonts w:ascii="Segoe UI" w:eastAsia="Times New Roman" w:hAnsi="Segoe UI" w:cs="Segoe UI"/>
+          <w:color w:val="1B2430"/>
+          <w:sz w:val="21"/>
+          <w:szCs w:val="21"/>
+          <w:lang w:val="en"/>
+        </w:rPr>
+        <w:t>A test failover completed in the last quarter, with application validation</w:t>
+      </w:r>
+    </w:p>
+    <w:p>
+      <w:pPr>
+        <w:pStyle w:val="task-list-item"/>
+        <w:numPr>
+          <w:ilvl w:val="0"/>
+          <w:numId w:val="10"/>
+        </w:numPr>
+        <w:rPr>
+          <w:rFonts w:ascii="Segoe UI" w:eastAsia="Times New Roman" w:hAnsi="Segoe UI" w:cs="Segoe UI"/>
+          <w:color w:val="1B2430"/>
+          <w:sz w:val="21"/>
+          <w:szCs w:val="21"/>
+          <w:lang w:val="en"/>
+        </w:rPr>
+      </w:pPr>
+      <w:r>
+        <w:rPr>
+          <w:rFonts w:ascii="Segoe UI" w:eastAsia="Times New Roman" w:hAnsi="Segoe UI" w:cs="Segoe UI"/>
+          <w:color w:val="1B2430"/>
+          <w:sz w:val="21"/>
+          <w:szCs w:val="21"/>
+          <w:lang w:val="en"/>
+        </w:rPr>
+        <w:t>The Azure target network, DNS and access are ready</w:t>
+      </w:r>
+    </w:p>
+    <w:p>
+      <w:pPr>
+        <w:pStyle w:val="task-list-item"/>
+        <w:numPr>
+          <w:ilvl w:val="0"/>
+          <w:numId w:val="10"/>
+        </w:numPr>
+        <w:rPr>
+          <w:rFonts w:ascii="Segoe UI" w:eastAsia="Times New Roman" w:hAnsi="Segoe UI" w:cs="Segoe UI"/>
+          <w:color w:val="1B2430"/>
+          <w:sz w:val="21"/>
+          <w:szCs w:val="21"/>
+          <w:lang w:val="en"/>
+        </w:rPr>
+      </w:pPr>
+      <w:r>
+        <w:rPr>
+          <w:rFonts w:ascii="Segoe UI" w:eastAsia="Times New Roman" w:hAnsi="Segoe UI" w:cs="Segoe UI"/>
+          <w:color w:val="1B2430"/>
+          <w:sz w:val="21"/>
+          <w:szCs w:val="21"/>
+          <w:lang w:val="en"/>
+        </w:rPr>
+        <w:t>The failback path is documented, including the unmanaged-VM case</w:t>
+      </w:r>
+    </w:p>
+    <w:p>
+      <w:pPr>
+        <w:pStyle w:val="task-list-item"/>
+        <w:numPr>
+          <w:ilvl w:val="0"/>
+          <w:numId w:val="10"/>
         </w:numPr>
         <w:rPr>
           <w:rFonts w:ascii="Segoe UI" w:eastAsia="Times New Roman" w:hAnsi="Segoe UI" w:cs="Segoe UI"/>
@@ -2547,122 +3631,9 @@
 <file path=word/numbering.xml><?xml version="1.0" encoding="utf-8"?>
 <w:numbering xmlns:wpc="http://schemas.microsoft.com/office/word/2010/wordprocessingCanvas" xmlns:cx="http://schemas.microsoft.com/office/drawing/2014/chartex" xmlns:cx1="http://schemas.microsoft.com/office/drawing/2015/9/8/chartex" xmlns:cx2="http://schemas.microsoft.com/office/drawing/2015/10/21/chartex" xmlns:cx3="http://schemas.microsoft.com/office/drawing/2016/5/9/chartex" xmlns:cx4="http://schemas.microsoft.com/office/drawing/2016/5/10/chartex" xmlns:cx5="http://schemas.microsoft.com/office/drawing/2016/5/11/chartex" xmlns:cx6="http://schemas.microsoft.com/office/drawing/2016/5/12/chartex" xmlns:cx7="http://schemas.microsoft.com/office/drawing/2016/5/13/chartex" xmlns:cx8="http://schemas.microsoft.com/office/drawing/2016/5/14/chartex" xmlns:mc="http://schemas.openxmlformats.org/markup-compatibility/2006" xmlns:aink="http://schemas.microsoft.com/office/drawing/2016/ink" xmlns:am3d="http://schemas.microsoft.com/office/drawing/2017/model3d" xmlns:o="urn:schemas-microsoft-com:office:office" xmlns:oel="http://schemas.microsoft.com/office/2019/extlst" xmlns:r="http://schemas.openxmlformats.org/officeDocument/2006/relationships" xmlns:m="http://schemas.openxmlformats.org/officeDocument/2006/math" xmlns:v="urn:schemas-microsoft-com:vml" xmlns:wp14="http://schemas.microsoft.com/office/word/2010/wordprocessingDrawing" xmlns:wp="http://schemas.openxmlformats.org/drawingml/2006/wordprocessingDrawing" xmlns:w10="urn:schemas-microsoft-com:office:word" xmlns:w="http://schemas.openxmlformats.org/wordprocessingml/2006/main" xmlns:w14="http://schemas.microsoft.com/office/word/2010/wordml" xmlns:w15="http://schemas.microsoft.com/office/word/2012/wordml" xmlns:w16cex="http://schemas.microsoft.com/office/word/2018/wordml/cex" xmlns:w16cid="http://schemas.microsoft.com/office/word/2016/wordml/cid" xmlns:w16="http://schemas.microsoft.com/office/word/2018/wordml" xmlns:w16du="http://schemas.microsoft.com/office/word/2023/wordml/word16du" xmlns:w16sdtdh="http://schemas.microsoft.com/office/word/2020/wordml/sdtdatahash" xmlns:w16sdtfl="http://schemas.microsoft.com/office/word/2024/wordml/sdtformatlock" xmlns:w16se="http://schemas.microsoft.com/office/word/2015/wordml/symex" xmlns:wpg="http://schemas.microsoft.com/office/word/2010/wordprocessingGroup" xmlns:wpi="http://schemas.microsoft.com/office/word/2010/wordprocessingInk" xmlns:wne="http://schemas.microsoft.com/office/word/2006/wordml" xmlns:wps="http://schemas.microsoft.com/office/word/2010/wordprocessingShape" mc:Ignorable="w14 w15 w16se w16cid w16 w16cex w16sdtdh w16sdtfl w16du wp14">
   <w:abstractNum w:abstractNumId="0" w15:restartNumberingAfterBreak="0">
-    <w:nsid w:val="08973995"/>
+    <w:nsid w:val="096C37C1"/>
     <w:multiLevelType w:val="multilevel"/>
-    <w:tmpl w:val="B1A81F12"/>
-    <w:lvl w:ilvl="0">
-      <w:start w:val="1"/>
-      <w:numFmt w:val="decimal"/>
-      <w:lvlText w:val="%1."/>
-      <w:lvlJc w:val="left"/>
-      <w:pPr>
-        <w:tabs>
-          <w:tab w:val="num" w:pos="720"/>
-        </w:tabs>
-        <w:ind w:left="720" w:hanging="360"/>
-      </w:pPr>
-    </w:lvl>
-    <w:lvl w:ilvl="1" w:tentative="1">
-      <w:start w:val="1"/>
-      <w:numFmt w:val="decimal"/>
-      <w:lvlText w:val="%2."/>
-      <w:lvlJc w:val="left"/>
-      <w:pPr>
-        <w:tabs>
-          <w:tab w:val="num" w:pos="1440"/>
-        </w:tabs>
-        <w:ind w:left="1440" w:hanging="360"/>
-      </w:pPr>
-    </w:lvl>
-    <w:lvl w:ilvl="2" w:tentative="1">
-      <w:start w:val="1"/>
-      <w:numFmt w:val="decimal"/>
-      <w:lvlText w:val="%3."/>
-      <w:lvlJc w:val="left"/>
-      <w:pPr>
-        <w:tabs>
-          <w:tab w:val="num" w:pos="2160"/>
-        </w:tabs>
-        <w:ind w:left="2160" w:hanging="360"/>
-      </w:pPr>
-    </w:lvl>
-    <w:lvl w:ilvl="3" w:tentative="1">
-      <w:start w:val="1"/>
-      <w:numFmt w:val="decimal"/>
-      <w:lvlText w:val="%4."/>
-      <w:lvlJc w:val="left"/>
-      <w:pPr>
-        <w:tabs>
-          <w:tab w:val="num" w:pos="2880"/>
-        </w:tabs>
-        <w:ind w:left="2880" w:hanging="360"/>
-      </w:pPr>
-    </w:lvl>
-    <w:lvl w:ilvl="4" w:tentative="1">
-      <w:start w:val="1"/>
-      <w:numFmt w:val="decimal"/>
-      <w:lvlText w:val="%5."/>
-      <w:lvlJc w:val="left"/>
-      <w:pPr>
-        <w:tabs>
-          <w:tab w:val="num" w:pos="3600"/>
-        </w:tabs>
-        <w:ind w:left="3600" w:hanging="360"/>
-      </w:pPr>
-    </w:lvl>
-    <w:lvl w:ilvl="5" w:tentative="1">
-      <w:start w:val="1"/>
-      <w:numFmt w:val="decimal"/>
-      <w:lvlText w:val="%6."/>
-      <w:lvlJc w:val="left"/>
-      <w:pPr>
-        <w:tabs>
-          <w:tab w:val="num" w:pos="4320"/>
-        </w:tabs>
-        <w:ind w:left="4320" w:hanging="360"/>
-      </w:pPr>
-    </w:lvl>
-    <w:lvl w:ilvl="6" w:tentative="1">
-      <w:start w:val="1"/>
-      <w:numFmt w:val="decimal"/>
-      <w:lvlText w:val="%7."/>
-      <w:lvlJc w:val="left"/>
-      <w:pPr>
-        <w:tabs>
-          <w:tab w:val="num" w:pos="5040"/>
-        </w:tabs>
-        <w:ind w:left="5040" w:hanging="360"/>
-      </w:pPr>
-    </w:lvl>
-    <w:lvl w:ilvl="7" w:tentative="1">
-      <w:start w:val="1"/>
-      <w:numFmt w:val="decimal"/>
-      <w:lvlText w:val="%8."/>
-      <w:lvlJc w:val="left"/>
-      <w:pPr>
-        <w:tabs>
-          <w:tab w:val="num" w:pos="5760"/>
-        </w:tabs>
-        <w:ind w:left="5760" w:hanging="360"/>
-      </w:pPr>
-    </w:lvl>
-    <w:lvl w:ilvl="8" w:tentative="1">
-      <w:start w:val="1"/>
-      <w:numFmt w:val="decimal"/>
-      <w:lvlText w:val="%9."/>
-      <w:lvlJc w:val="left"/>
-      <w:pPr>
-        <w:tabs>
-          <w:tab w:val="num" w:pos="6480"/>
-        </w:tabs>
-        <w:ind w:left="6480" w:hanging="360"/>
-      </w:pPr>
-    </w:lvl>
-  </w:abstractNum>
-  <w:abstractNum w:abstractNumId="1" w15:restartNumberingAfterBreak="0">
-    <w:nsid w:val="240D4DE3"/>
-    <w:multiLevelType w:val="multilevel"/>
-    <w:tmpl w:val="615A283C"/>
+    <w:tmpl w:val="2D4AB98A"/>
     <w:lvl w:ilvl="0">
       <w:start w:val="1"/>
       <w:numFmt w:val="bullet"/>
@@ -2808,10 +3779,10 @@
       </w:rPr>
     </w:lvl>
   </w:abstractNum>
-  <w:abstractNum w:abstractNumId="2" w15:restartNumberingAfterBreak="0">
-    <w:nsid w:val="2A302700"/>
+  <w:abstractNum w:abstractNumId="1" w15:restartNumberingAfterBreak="0">
+    <w:nsid w:val="1FC45CBE"/>
     <w:multiLevelType w:val="multilevel"/>
-    <w:tmpl w:val="E51E750C"/>
+    <w:tmpl w:val="4162DAB2"/>
     <w:lvl w:ilvl="0">
       <w:start w:val="1"/>
       <w:numFmt w:val="decimal"/>
@@ -2921,10 +3892,349 @@
       </w:pPr>
     </w:lvl>
   </w:abstractNum>
+  <w:abstractNum w:abstractNumId="2" w15:restartNumberingAfterBreak="0">
+    <w:nsid w:val="20BE5A70"/>
+    <w:multiLevelType w:val="multilevel"/>
+    <w:tmpl w:val="6B54FC46"/>
+    <w:lvl w:ilvl="0">
+      <w:start w:val="1"/>
+      <w:numFmt w:val="decimal"/>
+      <w:lvlText w:val="%1."/>
+      <w:lvlJc w:val="left"/>
+      <w:pPr>
+        <w:tabs>
+          <w:tab w:val="num" w:pos="720"/>
+        </w:tabs>
+        <w:ind w:left="720" w:hanging="360"/>
+      </w:pPr>
+    </w:lvl>
+    <w:lvl w:ilvl="1" w:tentative="1">
+      <w:start w:val="1"/>
+      <w:numFmt w:val="decimal"/>
+      <w:lvlText w:val="%2."/>
+      <w:lvlJc w:val="left"/>
+      <w:pPr>
+        <w:tabs>
+          <w:tab w:val="num" w:pos="1440"/>
+        </w:tabs>
+        <w:ind w:left="1440" w:hanging="360"/>
+      </w:pPr>
+    </w:lvl>
+    <w:lvl w:ilvl="2" w:tentative="1">
+      <w:start w:val="1"/>
+      <w:numFmt w:val="decimal"/>
+      <w:lvlText w:val="%3."/>
+      <w:lvlJc w:val="left"/>
+      <w:pPr>
+        <w:tabs>
+          <w:tab w:val="num" w:pos="2160"/>
+        </w:tabs>
+        <w:ind w:left="2160" w:hanging="360"/>
+      </w:pPr>
+    </w:lvl>
+    <w:lvl w:ilvl="3" w:tentative="1">
+      <w:start w:val="1"/>
+      <w:numFmt w:val="decimal"/>
+      <w:lvlText w:val="%4."/>
+      <w:lvlJc w:val="left"/>
+      <w:pPr>
+        <w:tabs>
+          <w:tab w:val="num" w:pos="2880"/>
+        </w:tabs>
+        <w:ind w:left="2880" w:hanging="360"/>
+      </w:pPr>
+    </w:lvl>
+    <w:lvl w:ilvl="4" w:tentative="1">
+      <w:start w:val="1"/>
+      <w:numFmt w:val="decimal"/>
+      <w:lvlText w:val="%5."/>
+      <w:lvlJc w:val="left"/>
+      <w:pPr>
+        <w:tabs>
+          <w:tab w:val="num" w:pos="3600"/>
+        </w:tabs>
+        <w:ind w:left="3600" w:hanging="360"/>
+      </w:pPr>
+    </w:lvl>
+    <w:lvl w:ilvl="5" w:tentative="1">
+      <w:start w:val="1"/>
+      <w:numFmt w:val="decimal"/>
+      <w:lvlText w:val="%6."/>
+      <w:lvlJc w:val="left"/>
+      <w:pPr>
+        <w:tabs>
+          <w:tab w:val="num" w:pos="4320"/>
+        </w:tabs>
+        <w:ind w:left="4320" w:hanging="360"/>
+      </w:pPr>
+    </w:lvl>
+    <w:lvl w:ilvl="6" w:tentative="1">
+      <w:start w:val="1"/>
+      <w:numFmt w:val="decimal"/>
+      <w:lvlText w:val="%7."/>
+      <w:lvlJc w:val="left"/>
+      <w:pPr>
+        <w:tabs>
+          <w:tab w:val="num" w:pos="5040"/>
+        </w:tabs>
+        <w:ind w:left="5040" w:hanging="360"/>
+      </w:pPr>
+    </w:lvl>
+    <w:lvl w:ilvl="7" w:tentative="1">
+      <w:start w:val="1"/>
+      <w:numFmt w:val="decimal"/>
+      <w:lvlText w:val="%8."/>
+      <w:lvlJc w:val="left"/>
+      <w:pPr>
+        <w:tabs>
+          <w:tab w:val="num" w:pos="5760"/>
+        </w:tabs>
+        <w:ind w:left="5760" w:hanging="360"/>
+      </w:pPr>
+    </w:lvl>
+    <w:lvl w:ilvl="8" w:tentative="1">
+      <w:start w:val="1"/>
+      <w:numFmt w:val="decimal"/>
+      <w:lvlText w:val="%9."/>
+      <w:lvlJc w:val="left"/>
+      <w:pPr>
+        <w:tabs>
+          <w:tab w:val="num" w:pos="6480"/>
+        </w:tabs>
+        <w:ind w:left="6480" w:hanging="360"/>
+      </w:pPr>
+    </w:lvl>
+  </w:abstractNum>
   <w:abstractNum w:abstractNumId="3" w15:restartNumberingAfterBreak="0">
-    <w:nsid w:val="3ACD030F"/>
+    <w:nsid w:val="2569637F"/>
     <w:multiLevelType w:val="multilevel"/>
-    <w:tmpl w:val="9FC856EA"/>
+    <w:tmpl w:val="8EE4249A"/>
+    <w:lvl w:ilvl="0">
+      <w:start w:val="1"/>
+      <w:numFmt w:val="decimal"/>
+      <w:lvlText w:val="%1."/>
+      <w:lvlJc w:val="left"/>
+      <w:pPr>
+        <w:tabs>
+          <w:tab w:val="num" w:pos="720"/>
+        </w:tabs>
+        <w:ind w:left="720" w:hanging="360"/>
+      </w:pPr>
+    </w:lvl>
+    <w:lvl w:ilvl="1" w:tentative="1">
+      <w:start w:val="1"/>
+      <w:numFmt w:val="decimal"/>
+      <w:lvlText w:val="%2."/>
+      <w:lvlJc w:val="left"/>
+      <w:pPr>
+        <w:tabs>
+          <w:tab w:val="num" w:pos="1440"/>
+        </w:tabs>
+        <w:ind w:left="1440" w:hanging="360"/>
+      </w:pPr>
+    </w:lvl>
+    <w:lvl w:ilvl="2" w:tentative="1">
+      <w:start w:val="1"/>
+      <w:numFmt w:val="decimal"/>
+      <w:lvlText w:val="%3."/>
+      <w:lvlJc w:val="left"/>
+      <w:pPr>
+        <w:tabs>
+          <w:tab w:val="num" w:pos="2160"/>
+        </w:tabs>
+        <w:ind w:left="2160" w:hanging="360"/>
+      </w:pPr>
+    </w:lvl>
+    <w:lvl w:ilvl="3" w:tentative="1">
+      <w:start w:val="1"/>
+      <w:numFmt w:val="decimal"/>
+      <w:lvlText w:val="%4."/>
+      <w:lvlJc w:val="left"/>
+      <w:pPr>
+        <w:tabs>
+          <w:tab w:val="num" w:pos="2880"/>
+        </w:tabs>
+        <w:ind w:left="2880" w:hanging="360"/>
+      </w:pPr>
+    </w:lvl>
+    <w:lvl w:ilvl="4" w:tentative="1">
+      <w:start w:val="1"/>
+      <w:numFmt w:val="decimal"/>
+      <w:lvlText w:val="%5."/>
+      <w:lvlJc w:val="left"/>
+      <w:pPr>
+        <w:tabs>
+          <w:tab w:val="num" w:pos="3600"/>
+        </w:tabs>
+        <w:ind w:left="3600" w:hanging="360"/>
+      </w:pPr>
+    </w:lvl>
+    <w:lvl w:ilvl="5" w:tentative="1">
+      <w:start w:val="1"/>
+      <w:numFmt w:val="decimal"/>
+      <w:lvlText w:val="%6."/>
+      <w:lvlJc w:val="left"/>
+      <w:pPr>
+        <w:tabs>
+          <w:tab w:val="num" w:pos="4320"/>
+        </w:tabs>
+        <w:ind w:left="4320" w:hanging="360"/>
+      </w:pPr>
+    </w:lvl>
+    <w:lvl w:ilvl="6" w:tentative="1">
+      <w:start w:val="1"/>
+      <w:numFmt w:val="decimal"/>
+      <w:lvlText w:val="%7."/>
+      <w:lvlJc w:val="left"/>
+      <w:pPr>
+        <w:tabs>
+          <w:tab w:val="num" w:pos="5040"/>
+        </w:tabs>
+        <w:ind w:left="5040" w:hanging="360"/>
+      </w:pPr>
+    </w:lvl>
+    <w:lvl w:ilvl="7" w:tentative="1">
+      <w:start w:val="1"/>
+      <w:numFmt w:val="decimal"/>
+      <w:lvlText w:val="%8."/>
+      <w:lvlJc w:val="left"/>
+      <w:pPr>
+        <w:tabs>
+          <w:tab w:val="num" w:pos="5760"/>
+        </w:tabs>
+        <w:ind w:left="5760" w:hanging="360"/>
+      </w:pPr>
+    </w:lvl>
+    <w:lvl w:ilvl="8" w:tentative="1">
+      <w:start w:val="1"/>
+      <w:numFmt w:val="decimal"/>
+      <w:lvlText w:val="%9."/>
+      <w:lvlJc w:val="left"/>
+      <w:pPr>
+        <w:tabs>
+          <w:tab w:val="num" w:pos="6480"/>
+        </w:tabs>
+        <w:ind w:left="6480" w:hanging="360"/>
+      </w:pPr>
+    </w:lvl>
+  </w:abstractNum>
+  <w:abstractNum w:abstractNumId="4" w15:restartNumberingAfterBreak="0">
+    <w:nsid w:val="2B1A3B2B"/>
+    <w:multiLevelType w:val="multilevel"/>
+    <w:tmpl w:val="4F40D1A0"/>
+    <w:lvl w:ilvl="0">
+      <w:start w:val="1"/>
+      <w:numFmt w:val="decimal"/>
+      <w:lvlText w:val="%1."/>
+      <w:lvlJc w:val="left"/>
+      <w:pPr>
+        <w:tabs>
+          <w:tab w:val="num" w:pos="720"/>
+        </w:tabs>
+        <w:ind w:left="720" w:hanging="360"/>
+      </w:pPr>
+    </w:lvl>
+    <w:lvl w:ilvl="1" w:tentative="1">
+      <w:start w:val="1"/>
+      <w:numFmt w:val="decimal"/>
+      <w:lvlText w:val="%2."/>
+      <w:lvlJc w:val="left"/>
+      <w:pPr>
+        <w:tabs>
+          <w:tab w:val="num" w:pos="1440"/>
+        </w:tabs>
+        <w:ind w:left="1440" w:hanging="360"/>
+      </w:pPr>
+    </w:lvl>
+    <w:lvl w:ilvl="2" w:tentative="1">
+      <w:start w:val="1"/>
+      <w:numFmt w:val="decimal"/>
+      <w:lvlText w:val="%3."/>
+      <w:lvlJc w:val="left"/>
+      <w:pPr>
+        <w:tabs>
+          <w:tab w:val="num" w:pos="2160"/>
+        </w:tabs>
+        <w:ind w:left="2160" w:hanging="360"/>
+      </w:pPr>
+    </w:lvl>
+    <w:lvl w:ilvl="3" w:tentative="1">
+      <w:start w:val="1"/>
+      <w:numFmt w:val="decimal"/>
+      <w:lvlText w:val="%4."/>
+      <w:lvlJc w:val="left"/>
+      <w:pPr>
+        <w:tabs>
+          <w:tab w:val="num" w:pos="2880"/>
+        </w:tabs>
+        <w:ind w:left="2880" w:hanging="360"/>
+      </w:pPr>
+    </w:lvl>
+    <w:lvl w:ilvl="4" w:tentative="1">
+      <w:start w:val="1"/>
+      <w:numFmt w:val="decimal"/>
+      <w:lvlText w:val="%5."/>
+      <w:lvlJc w:val="left"/>
+      <w:pPr>
+        <w:tabs>
+          <w:tab w:val="num" w:pos="3600"/>
+        </w:tabs>
+        <w:ind w:left="3600" w:hanging="360"/>
+      </w:pPr>
+    </w:lvl>
+    <w:lvl w:ilvl="5" w:tentative="1">
+      <w:start w:val="1"/>
+      <w:numFmt w:val="decimal"/>
+      <w:lvlText w:val="%6."/>
+      <w:lvlJc w:val="left"/>
+      <w:pPr>
+        <w:tabs>
+          <w:tab w:val="num" w:pos="4320"/>
+        </w:tabs>
+        <w:ind w:left="4320" w:hanging="360"/>
+      </w:pPr>
+    </w:lvl>
+    <w:lvl w:ilvl="6" w:tentative="1">
+      <w:start w:val="1"/>
+      <w:numFmt w:val="decimal"/>
+      <w:lvlText w:val="%7."/>
+      <w:lvlJc w:val="left"/>
+      <w:pPr>
+        <w:tabs>
+          <w:tab w:val="num" w:pos="5040"/>
+        </w:tabs>
+        <w:ind w:left="5040" w:hanging="360"/>
+      </w:pPr>
+    </w:lvl>
+    <w:lvl w:ilvl="7" w:tentative="1">
+      <w:start w:val="1"/>
+      <w:numFmt w:val="decimal"/>
+      <w:lvlText w:val="%8."/>
+      <w:lvlJc w:val="left"/>
+      <w:pPr>
+        <w:tabs>
+          <w:tab w:val="num" w:pos="5760"/>
+        </w:tabs>
+        <w:ind w:left="5760" w:hanging="360"/>
+      </w:pPr>
+    </w:lvl>
+    <w:lvl w:ilvl="8" w:tentative="1">
+      <w:start w:val="1"/>
+      <w:numFmt w:val="decimal"/>
+      <w:lvlText w:val="%9."/>
+      <w:lvlJc w:val="left"/>
+      <w:pPr>
+        <w:tabs>
+          <w:tab w:val="num" w:pos="6480"/>
+        </w:tabs>
+        <w:ind w:left="6480" w:hanging="360"/>
+      </w:pPr>
+    </w:lvl>
+  </w:abstractNum>
+  <w:abstractNum w:abstractNumId="5" w15:restartNumberingAfterBreak="0">
+    <w:nsid w:val="2CC83141"/>
+    <w:multiLevelType w:val="multilevel"/>
+    <w:tmpl w:val="AADADC26"/>
     <w:lvl w:ilvl="0">
       <w:start w:val="1"/>
       <w:numFmt w:val="bullet"/>
@@ -3070,123 +4380,10 @@
       </w:rPr>
     </w:lvl>
   </w:abstractNum>
-  <w:abstractNum w:abstractNumId="4" w15:restartNumberingAfterBreak="0">
-    <w:nsid w:val="551123FA"/>
+  <w:abstractNum w:abstractNumId="6" w15:restartNumberingAfterBreak="0">
+    <w:nsid w:val="34166FEC"/>
     <w:multiLevelType w:val="multilevel"/>
-    <w:tmpl w:val="AB489782"/>
-    <w:lvl w:ilvl="0">
-      <w:start w:val="1"/>
-      <w:numFmt w:val="decimal"/>
-      <w:lvlText w:val="%1."/>
-      <w:lvlJc w:val="left"/>
-      <w:pPr>
-        <w:tabs>
-          <w:tab w:val="num" w:pos="720"/>
-        </w:tabs>
-        <w:ind w:left="720" w:hanging="360"/>
-      </w:pPr>
-    </w:lvl>
-    <w:lvl w:ilvl="1" w:tentative="1">
-      <w:start w:val="1"/>
-      <w:numFmt w:val="decimal"/>
-      <w:lvlText w:val="%2."/>
-      <w:lvlJc w:val="left"/>
-      <w:pPr>
-        <w:tabs>
-          <w:tab w:val="num" w:pos="1440"/>
-        </w:tabs>
-        <w:ind w:left="1440" w:hanging="360"/>
-      </w:pPr>
-    </w:lvl>
-    <w:lvl w:ilvl="2" w:tentative="1">
-      <w:start w:val="1"/>
-      <w:numFmt w:val="decimal"/>
-      <w:lvlText w:val="%3."/>
-      <w:lvlJc w:val="left"/>
-      <w:pPr>
-        <w:tabs>
-          <w:tab w:val="num" w:pos="2160"/>
-        </w:tabs>
-        <w:ind w:left="2160" w:hanging="360"/>
-      </w:pPr>
-    </w:lvl>
-    <w:lvl w:ilvl="3" w:tentative="1">
-      <w:start w:val="1"/>
-      <w:numFmt w:val="decimal"/>
-      <w:lvlText w:val="%4."/>
-      <w:lvlJc w:val="left"/>
-      <w:pPr>
-        <w:tabs>
-          <w:tab w:val="num" w:pos="2880"/>
-        </w:tabs>
-        <w:ind w:left="2880" w:hanging="360"/>
-      </w:pPr>
-    </w:lvl>
-    <w:lvl w:ilvl="4" w:tentative="1">
-      <w:start w:val="1"/>
-      <w:numFmt w:val="decimal"/>
-      <w:lvlText w:val="%5."/>
-      <w:lvlJc w:val="left"/>
-      <w:pPr>
-        <w:tabs>
-          <w:tab w:val="num" w:pos="3600"/>
-        </w:tabs>
-        <w:ind w:left="3600" w:hanging="360"/>
-      </w:pPr>
-    </w:lvl>
-    <w:lvl w:ilvl="5" w:tentative="1">
-      <w:start w:val="1"/>
-      <w:numFmt w:val="decimal"/>
-      <w:lvlText w:val="%6."/>
-      <w:lvlJc w:val="left"/>
-      <w:pPr>
-        <w:tabs>
-          <w:tab w:val="num" w:pos="4320"/>
-        </w:tabs>
-        <w:ind w:left="4320" w:hanging="360"/>
-      </w:pPr>
-    </w:lvl>
-    <w:lvl w:ilvl="6" w:tentative="1">
-      <w:start w:val="1"/>
-      <w:numFmt w:val="decimal"/>
-      <w:lvlText w:val="%7."/>
-      <w:lvlJc w:val="left"/>
-      <w:pPr>
-        <w:tabs>
-          <w:tab w:val="num" w:pos="5040"/>
-        </w:tabs>
-        <w:ind w:left="5040" w:hanging="360"/>
-      </w:pPr>
-    </w:lvl>
-    <w:lvl w:ilvl="7" w:tentative="1">
-      <w:start w:val="1"/>
-      <w:numFmt w:val="decimal"/>
-      <w:lvlText w:val="%8."/>
-      <w:lvlJc w:val="left"/>
-      <w:pPr>
-        <w:tabs>
-          <w:tab w:val="num" w:pos="5760"/>
-        </w:tabs>
-        <w:ind w:left="5760" w:hanging="360"/>
-      </w:pPr>
-    </w:lvl>
-    <w:lvl w:ilvl="8" w:tentative="1">
-      <w:start w:val="1"/>
-      <w:numFmt w:val="decimal"/>
-      <w:lvlText w:val="%9."/>
-      <w:lvlJc w:val="left"/>
-      <w:pPr>
-        <w:tabs>
-          <w:tab w:val="num" w:pos="6480"/>
-        </w:tabs>
-        <w:ind w:left="6480" w:hanging="360"/>
-      </w:pPr>
-    </w:lvl>
-  </w:abstractNum>
-  <w:abstractNum w:abstractNumId="5" w15:restartNumberingAfterBreak="0">
-    <w:nsid w:val="555D1F7C"/>
-    <w:multiLevelType w:val="multilevel"/>
-    <w:tmpl w:val="3A5C2382"/>
+    <w:tmpl w:val="EE62BE5C"/>
     <w:lvl w:ilvl="0">
       <w:start w:val="1"/>
       <w:numFmt w:val="bullet"/>
@@ -3332,10 +4529,159 @@
       </w:rPr>
     </w:lvl>
   </w:abstractNum>
-  <w:abstractNum w:abstractNumId="6" w15:restartNumberingAfterBreak="0">
-    <w:nsid w:val="5A581B14"/>
+  <w:abstractNum w:abstractNumId="7" w15:restartNumberingAfterBreak="0">
+    <w:nsid w:val="6EB90E1D"/>
     <w:multiLevelType w:val="multilevel"/>
-    <w:tmpl w:val="22709E7E"/>
+    <w:tmpl w:val="2F0AE358"/>
+    <w:lvl w:ilvl="0">
+      <w:start w:val="1"/>
+      <w:numFmt w:val="bullet"/>
+      <w:lvlText w:val=""/>
+      <w:lvlJc w:val="left"/>
+      <w:pPr>
+        <w:tabs>
+          <w:tab w:val="num" w:pos="720"/>
+        </w:tabs>
+        <w:ind w:left="720" w:hanging="360"/>
+      </w:pPr>
+      <w:rPr>
+        <w:rFonts w:ascii="Symbol" w:hAnsi="Symbol" w:hint="default"/>
+        <w:sz w:val="20"/>
+      </w:rPr>
+    </w:lvl>
+    <w:lvl w:ilvl="1" w:tentative="1">
+      <w:start w:val="1"/>
+      <w:numFmt w:val="bullet"/>
+      <w:lvlText w:val="o"/>
+      <w:lvlJc w:val="left"/>
+      <w:pPr>
+        <w:tabs>
+          <w:tab w:val="num" w:pos="1440"/>
+        </w:tabs>
+        <w:ind w:left="1440" w:hanging="360"/>
+      </w:pPr>
+      <w:rPr>
+        <w:rFonts w:ascii="Courier New" w:hAnsi="Courier New" w:hint="default"/>
+        <w:sz w:val="20"/>
+      </w:rPr>
+    </w:lvl>
+    <w:lvl w:ilvl="2" w:tentative="1">
+      <w:start w:val="1"/>
+      <w:numFmt w:val="bullet"/>
+      <w:lvlText w:val=""/>
+      <w:lvlJc w:val="left"/>
+      <w:pPr>
+        <w:tabs>
+          <w:tab w:val="num" w:pos="2160"/>
+        </w:tabs>
+        <w:ind w:left="2160" w:hanging="360"/>
+      </w:pPr>
+      <w:rPr>
+        <w:rFonts w:ascii="Wingdings" w:hAnsi="Wingdings" w:hint="default"/>
+        <w:sz w:val="20"/>
+      </w:rPr>
+    </w:lvl>
+    <w:lvl w:ilvl="3" w:tentative="1">
+      <w:start w:val="1"/>
+      <w:numFmt w:val="bullet"/>
+      <w:lvlText w:val=""/>
+      <w:lvlJc w:val="left"/>
+      <w:pPr>
+        <w:tabs>
+          <w:tab w:val="num" w:pos="2880"/>
+        </w:tabs>
+        <w:ind w:left="2880" w:hanging="360"/>
+      </w:pPr>
+      <w:rPr>
+        <w:rFonts w:ascii="Wingdings" w:hAnsi="Wingdings" w:hint="default"/>
+        <w:sz w:val="20"/>
+      </w:rPr>
+    </w:lvl>
+    <w:lvl w:ilvl="4" w:tentative="1">
+      <w:start w:val="1"/>
+      <w:numFmt w:val="bullet"/>
+      <w:lvlText w:val=""/>
+      <w:lvlJc w:val="left"/>
+      <w:pPr>
+        <w:tabs>
+          <w:tab w:val="num" w:pos="3600"/>
+        </w:tabs>
+        <w:ind w:left="3600" w:hanging="360"/>
+      </w:pPr>
+      <w:rPr>
+        <w:rFonts w:ascii="Wingdings" w:hAnsi="Wingdings" w:hint="default"/>
+        <w:sz w:val="20"/>
+      </w:rPr>
+    </w:lvl>
+    <w:lvl w:ilvl="5" w:tentative="1">
+      <w:start w:val="1"/>
+      <w:numFmt w:val="bullet"/>
+      <w:lvlText w:val=""/>
+      <w:lvlJc w:val="left"/>
+      <w:pPr>
+        <w:tabs>
+          <w:tab w:val="num" w:pos="4320"/>
+        </w:tabs>
+        <w:ind w:left="4320" w:hanging="360"/>
+      </w:pPr>
+      <w:rPr>
+        <w:rFonts w:ascii="Wingdings" w:hAnsi="Wingdings" w:hint="default"/>
+        <w:sz w:val="20"/>
+      </w:rPr>
+    </w:lvl>
+    <w:lvl w:ilvl="6" w:tentative="1">
+      <w:start w:val="1"/>
+      <w:numFmt w:val="bullet"/>
+      <w:lvlText w:val=""/>
+      <w:lvlJc w:val="left"/>
+      <w:pPr>
+        <w:tabs>
+          <w:tab w:val="num" w:pos="5040"/>
+        </w:tabs>
+        <w:ind w:left="5040" w:hanging="360"/>
+      </w:pPr>
+      <w:rPr>
+        <w:rFonts w:ascii="Wingdings" w:hAnsi="Wingdings" w:hint="default"/>
+        <w:sz w:val="20"/>
+      </w:rPr>
+    </w:lvl>
+    <w:lvl w:ilvl="7" w:tentative="1">
+      <w:start w:val="1"/>
+      <w:numFmt w:val="bullet"/>
+      <w:lvlText w:val=""/>
+      <w:lvlJc w:val="left"/>
+      <w:pPr>
+        <w:tabs>
+          <w:tab w:val="num" w:pos="5760"/>
+        </w:tabs>
+        <w:ind w:left="5760" w:hanging="360"/>
+      </w:pPr>
+      <w:rPr>
+        <w:rFonts w:ascii="Wingdings" w:hAnsi="Wingdings" w:hint="default"/>
+        <w:sz w:val="20"/>
+      </w:rPr>
+    </w:lvl>
+    <w:lvl w:ilvl="8" w:tentative="1">
+      <w:start w:val="1"/>
+      <w:numFmt w:val="bullet"/>
+      <w:lvlText w:val=""/>
+      <w:lvlJc w:val="left"/>
+      <w:pPr>
+        <w:tabs>
+          <w:tab w:val="num" w:pos="6480"/>
+        </w:tabs>
+        <w:ind w:left="6480" w:hanging="360"/>
+      </w:pPr>
+      <w:rPr>
+        <w:rFonts w:ascii="Wingdings" w:hAnsi="Wingdings" w:hint="default"/>
+        <w:sz w:val="20"/>
+      </w:rPr>
+    </w:lvl>
+  </w:abstractNum>
+  <w:abstractNum w:abstractNumId="8" w15:restartNumberingAfterBreak="0">
+    <w:nsid w:val="72951067"/>
+    <w:multiLevelType w:val="multilevel"/>
+    <w:tmpl w:val="F22E6B94"/>
     <w:lvl w:ilvl="0">
       <w:start w:val="1"/>
       <w:numFmt w:val="decimal"/>
@@ -3445,14 +4791,14 @@
       </w:pPr>
     </w:lvl>
   </w:abstractNum>
-  <w:abstractNum w:abstractNumId="7" w15:restartNumberingAfterBreak="0">
-    <w:nsid w:val="62C14537"/>
+  <w:abstractNum w:abstractNumId="9" w15:restartNumberingAfterBreak="0">
+    <w:nsid w:val="73F43031"/>
     <w:multiLevelType w:val="multilevel"/>
-    <w:tmpl w:val="08ECB286"/>
+    <w:tmpl w:val="050CEFAE"/>
     <w:lvl w:ilvl="0">
       <w:start w:val="1"/>
-      <w:numFmt w:val="decimal"/>
-      <w:lvlText w:val="%1."/>
+      <w:numFmt w:val="bullet"/>
+      <w:lvlText w:val=""/>
       <w:lvlJc w:val="left"/>
       <w:pPr>
         <w:tabs>
@@ -3460,11 +4806,15 @@
         </w:tabs>
         <w:ind w:left="720" w:hanging="360"/>
       </w:pPr>
+      <w:rPr>
+        <w:rFonts w:ascii="Symbol" w:hAnsi="Symbol" w:hint="default"/>
+        <w:sz w:val="20"/>
+      </w:rPr>
     </w:lvl>
     <w:lvl w:ilvl="1" w:tentative="1">
       <w:start w:val="1"/>
-      <w:numFmt w:val="decimal"/>
-      <w:lvlText w:val="%2."/>
+      <w:numFmt w:val="bullet"/>
+      <w:lvlText w:val="o"/>
       <w:lvlJc w:val="left"/>
       <w:pPr>
         <w:tabs>
@@ -3472,11 +4822,15 @@
         </w:tabs>
         <w:ind w:left="1440" w:hanging="360"/>
       </w:pPr>
+      <w:rPr>
+        <w:rFonts w:ascii="Courier New" w:hAnsi="Courier New" w:hint="default"/>
+        <w:sz w:val="20"/>
+      </w:rPr>
     </w:lvl>
     <w:lvl w:ilvl="2" w:tentative="1">
       <w:start w:val="1"/>
-      <w:numFmt w:val="decimal"/>
-      <w:lvlText w:val="%3."/>
+      <w:numFmt w:val="bullet"/>
+      <w:lvlText w:val=""/>
       <w:lvlJc w:val="left"/>
       <w:pPr>
         <w:tabs>
@@ -3484,11 +4838,15 @@
         </w:tabs>
         <w:ind w:left="2160" w:hanging="360"/>
       </w:pPr>
+      <w:rPr>
+        <w:rFonts w:ascii="Wingdings" w:hAnsi="Wingdings" w:hint="default"/>
+        <w:sz w:val="20"/>
+      </w:rPr>
     </w:lvl>
     <w:lvl w:ilvl="3" w:tentative="1">
       <w:start w:val="1"/>
-      <w:numFmt w:val="decimal"/>
-      <w:lvlText w:val="%4."/>
+      <w:numFmt w:val="bullet"/>
+      <w:lvlText w:val=""/>
       <w:lvlJc w:val="left"/>
       <w:pPr>
         <w:tabs>
@@ -3496,11 +4854,15 @@
         </w:tabs>
         <w:ind w:left="2880" w:hanging="360"/>
       </w:pPr>
+      <w:rPr>
+        <w:rFonts w:ascii="Wingdings" w:hAnsi="Wingdings" w:hint="default"/>
+        <w:sz w:val="20"/>
+      </w:rPr>
     </w:lvl>
     <w:lvl w:ilvl="4" w:tentative="1">
       <w:start w:val="1"/>
-      <w:numFmt w:val="decimal"/>
-      <w:lvlText w:val="%5."/>
+      <w:numFmt w:val="bullet"/>
+      <w:lvlText w:val=""/>
       <w:lvlJc w:val="left"/>
       <w:pPr>
         <w:tabs>
@@ -3508,11 +4870,15 @@
         </w:tabs>
         <w:ind w:left="3600" w:hanging="360"/>
       </w:pPr>
+      <w:rPr>
+        <w:rFonts w:ascii="Wingdings" w:hAnsi="Wingdings" w:hint="default"/>
+        <w:sz w:val="20"/>
+      </w:rPr>
     </w:lvl>
     <w:lvl w:ilvl="5" w:tentative="1">
       <w:start w:val="1"/>
-      <w:numFmt w:val="decimal"/>
-      <w:lvlText w:val="%6."/>
+      <w:numFmt w:val="bullet"/>
+      <w:lvlText w:val=""/>
       <w:lvlJc w:val="left"/>
       <w:pPr>
         <w:tabs>
@@ -3520,11 +4886,15 @@
         </w:tabs>
         <w:ind w:left="4320" w:hanging="360"/>
       </w:pPr>
+      <w:rPr>
+        <w:rFonts w:ascii="Wingdings" w:hAnsi="Wingdings" w:hint="default"/>
+        <w:sz w:val="20"/>
+      </w:rPr>
     </w:lvl>
     <w:lvl w:ilvl="6" w:tentative="1">
       <w:start w:val="1"/>
-      <w:numFmt w:val="decimal"/>
-      <w:lvlText w:val="%7."/>
+      <w:numFmt w:val="bullet"/>
+      <w:lvlText w:val=""/>
       <w:lvlJc w:val="left"/>
       <w:pPr>
         <w:tabs>
@@ -3532,11 +4902,15 @@
         </w:tabs>
         <w:ind w:left="5040" w:hanging="360"/>
       </w:pPr>
+      <w:rPr>
+        <w:rFonts w:ascii="Wingdings" w:hAnsi="Wingdings" w:hint="default"/>
+        <w:sz w:val="20"/>
+      </w:rPr>
     </w:lvl>
     <w:lvl w:ilvl="7" w:tentative="1">
       <w:start w:val="1"/>
-      <w:numFmt w:val="decimal"/>
-      <w:lvlText w:val="%8."/>
+      <w:numFmt w:val="bullet"/>
+      <w:lvlText w:val=""/>
       <w:lvlJc w:val="left"/>
       <w:pPr>
         <w:tabs>
@@ -3544,11 +4918,15 @@
         </w:tabs>
         <w:ind w:left="5760" w:hanging="360"/>
       </w:pPr>
+      <w:rPr>
+        <w:rFonts w:ascii="Wingdings" w:hAnsi="Wingdings" w:hint="default"/>
+        <w:sz w:val="20"/>
+      </w:rPr>
     </w:lvl>
     <w:lvl w:ilvl="8" w:tentative="1">
       <w:start w:val="1"/>
-      <w:numFmt w:val="decimal"/>
-      <w:lvlText w:val="%9."/>
+      <w:numFmt w:val="bullet"/>
+      <w:lvlText w:val=""/>
       <w:lvlJc w:val="left"/>
       <w:pPr>
         <w:tabs>
@@ -3556,31 +4934,41 @@
         </w:tabs>
         <w:ind w:left="6480" w:hanging="360"/>
       </w:pPr>
+      <w:rPr>
+        <w:rFonts w:ascii="Wingdings" w:hAnsi="Wingdings" w:hint="default"/>
+        <w:sz w:val="20"/>
+      </w:rPr>
     </w:lvl>
   </w:abstractNum>
-  <w:num w:numId="1" w16cid:durableId="1468669185">
+  <w:num w:numId="1" w16cid:durableId="1131634942">
+    <w:abstractNumId w:val="6"/>
+  </w:num>
+  <w:num w:numId="2" w16cid:durableId="1136603345">
+    <w:abstractNumId w:val="4"/>
+  </w:num>
+  <w:num w:numId="3" w16cid:durableId="279069616">
+    <w:abstractNumId w:val="7"/>
+  </w:num>
+  <w:num w:numId="4" w16cid:durableId="1348410536">
+    <w:abstractNumId w:val="8"/>
+  </w:num>
+  <w:num w:numId="5" w16cid:durableId="1330058575">
+    <w:abstractNumId w:val="2"/>
+  </w:num>
+  <w:num w:numId="6" w16cid:durableId="1322193808">
     <w:abstractNumId w:val="3"/>
   </w:num>
-  <w:num w:numId="2" w16cid:durableId="821845875">
-    <w:abstractNumId w:val="7"/>
+  <w:num w:numId="7" w16cid:durableId="1105659171">
+    <w:abstractNumId w:val="1"/>
   </w:num>
-  <w:num w:numId="3" w16cid:durableId="705450605">
+  <w:num w:numId="8" w16cid:durableId="713310429">
     <w:abstractNumId w:val="0"/>
   </w:num>
-  <w:num w:numId="4" w16cid:durableId="1984119754">
-    <w:abstractNumId w:val="4"/>
-  </w:num>
-  <w:num w:numId="5" w16cid:durableId="1540242690">
-    <w:abstractNumId w:val="6"/>
-  </w:num>
-  <w:num w:numId="6" w16cid:durableId="2006400389">
-    <w:abstractNumId w:val="2"/>
-  </w:num>
-  <w:num w:numId="7" w16cid:durableId="1396857272">
+  <w:num w:numId="9" w16cid:durableId="813646588">
     <w:abstractNumId w:val="5"/>
   </w:num>
-  <w:num w:numId="8" w16cid:durableId="112291480">
-    <w:abstractNumId w:val="1"/>
+  <w:num w:numId="10" w16cid:durableId="1111364437">
+    <w:abstractNumId w:val="9"/>
   </w:num>
 </w:numbering>
 </file>
@@ -4224,6 +5612,16 @@
       <w:bCs/>
     </w:rPr>
   </w:style>
+  <w:style w:type="character" w:styleId="Emphasis">
+    <w:name w:val="Emphasis"/>
+    <w:basedOn w:val="DefaultParagraphFont"/>
+    <w:uiPriority w:val="20"/>
+    <w:qFormat/>
+    <w:rPr>
+      <w:i/>
+      <w:iCs/>
+    </w:rPr>
+  </w:style>
   <w:style w:type="paragraph" w:customStyle="1" w:styleId="task-list-item">
     <w:name w:val="task-list-item"/>
     <w:basedOn w:val="Normal"/>

</xml_diff>